<commit_message>
feat(docs & sound) corrige o gdd e implementa músicas/sfx
</commit_message>
<xml_diff>
--- a/GDD_Neverland.docx
+++ b/GDD_Neverland.docx
@@ -132,12 +132,6 @@
         <w:gridCol w:w="6240"/>
       </w:tblGrid>
       <w:tr>
-        <w:tblPrEx>
-          <w:tblCellMar>
-            <w:top w:w="0" w:type="dxa"/>
-            <w:bottom w:w="0" w:type="dxa"/>
-          </w:tblCellMar>
-        </w:tblPrEx>
         <w:trPr>
           <w:tblHeader/>
         </w:trPr>
@@ -183,12 +177,6 @@
         </w:tc>
       </w:tr>
       <w:tr>
-        <w:tblPrEx>
-          <w:tblCellMar>
-            <w:top w:w="0" w:type="dxa"/>
-            <w:bottom w:w="0" w:type="dxa"/>
-          </w:tblCellMar>
-        </w:tblPrEx>
         <w:trPr>
           <w:cantSplit/>
         </w:trPr>
@@ -240,12 +228,6 @@
         </w:tc>
       </w:tr>
       <w:tr>
-        <w:tblPrEx>
-          <w:tblCellMar>
-            <w:top w:w="0" w:type="dxa"/>
-            <w:bottom w:w="0" w:type="dxa"/>
-          </w:tblCellMar>
-        </w:tblPrEx>
         <w:trPr>
           <w:cantSplit/>
         </w:trPr>
@@ -297,12 +279,6 @@
         </w:tc>
       </w:tr>
       <w:tr>
-        <w:tblPrEx>
-          <w:tblCellMar>
-            <w:top w:w="0" w:type="dxa"/>
-            <w:bottom w:w="0" w:type="dxa"/>
-          </w:tblCellMar>
-        </w:tblPrEx>
         <w:trPr>
           <w:cantSplit/>
         </w:trPr>
@@ -354,12 +330,6 @@
         </w:tc>
       </w:tr>
       <w:tr>
-        <w:tblPrEx>
-          <w:tblCellMar>
-            <w:top w:w="0" w:type="dxa"/>
-            <w:bottom w:w="0" w:type="dxa"/>
-          </w:tblCellMar>
-        </w:tblPrEx>
         <w:trPr>
           <w:cantSplit/>
         </w:trPr>
@@ -411,12 +381,6 @@
         </w:tc>
       </w:tr>
       <w:tr>
-        <w:tblPrEx>
-          <w:tblCellMar>
-            <w:top w:w="0" w:type="dxa"/>
-            <w:bottom w:w="0" w:type="dxa"/>
-          </w:tblCellMar>
-        </w:tblPrEx>
         <w:trPr>
           <w:cantSplit/>
         </w:trPr>
@@ -484,12 +448,6 @@
         </w:tc>
       </w:tr>
       <w:tr>
-        <w:tblPrEx>
-          <w:tblCellMar>
-            <w:top w:w="0" w:type="dxa"/>
-            <w:bottom w:w="0" w:type="dxa"/>
-          </w:tblCellMar>
-        </w:tblPrEx>
         <w:trPr>
           <w:cantSplit/>
         </w:trPr>
@@ -541,12 +499,6 @@
         </w:tc>
       </w:tr>
       <w:tr>
-        <w:tblPrEx>
-          <w:tblCellMar>
-            <w:top w:w="0" w:type="dxa"/>
-            <w:bottom w:w="0" w:type="dxa"/>
-          </w:tblCellMar>
-        </w:tblPrEx>
         <w:trPr>
           <w:cantSplit/>
         </w:trPr>
@@ -598,12 +550,6 @@
         </w:tc>
       </w:tr>
       <w:tr>
-        <w:tblPrEx>
-          <w:tblCellMar>
-            <w:top w:w="0" w:type="dxa"/>
-            <w:bottom w:w="0" w:type="dxa"/>
-          </w:tblCellMar>
-        </w:tblPrEx>
         <w:trPr>
           <w:cantSplit/>
         </w:trPr>
@@ -655,12 +601,6 @@
         </w:tc>
       </w:tr>
       <w:tr>
-        <w:tblPrEx>
-          <w:tblCellMar>
-            <w:top w:w="0" w:type="dxa"/>
-            <w:bottom w:w="0" w:type="dxa"/>
-          </w:tblCellMar>
-        </w:tblPrEx>
         <w:trPr>
           <w:cantSplit/>
         </w:trPr>
@@ -733,12 +673,6 @@
         <w:gridCol w:w="9360"/>
       </w:tblGrid>
       <w:tr>
-        <w:tblPrEx>
-          <w:tblCellMar>
-            <w:top w:w="0" w:type="dxa"/>
-            <w:bottom w:w="0" w:type="dxa"/>
-          </w:tblCellMar>
-        </w:tblPrEx>
         <w:tc>
           <w:tcPr>
             <w:tcW w:w="9360" w:type="dxa"/>
@@ -3600,12 +3534,6 @@
         <w:gridCol w:w="9360"/>
       </w:tblGrid>
       <w:tr>
-        <w:tblPrEx>
-          <w:tblCellMar>
-            <w:top w:w="0" w:type="dxa"/>
-            <w:bottom w:w="0" w:type="dxa"/>
-          </w:tblCellMar>
-        </w:tblPrEx>
         <w:tc>
           <w:tcPr>
             <w:tcW w:w="9360" w:type="dxa"/>
@@ -3681,12 +3609,6 @@
         <w:gridCol w:w="6240"/>
       </w:tblGrid>
       <w:tr>
-        <w:tblPrEx>
-          <w:tblCellMar>
-            <w:top w:w="0" w:type="dxa"/>
-            <w:bottom w:w="0" w:type="dxa"/>
-          </w:tblCellMar>
-        </w:tblPrEx>
         <w:trPr>
           <w:tblHeader/>
         </w:trPr>
@@ -3744,12 +3666,6 @@
         </w:tc>
       </w:tr>
       <w:tr>
-        <w:tblPrEx>
-          <w:tblCellMar>
-            <w:top w:w="0" w:type="dxa"/>
-            <w:bottom w:w="0" w:type="dxa"/>
-          </w:tblCellMar>
-        </w:tblPrEx>
         <w:trPr>
           <w:cantSplit/>
         </w:trPr>
@@ -3801,12 +3717,6 @@
         </w:tc>
       </w:tr>
       <w:tr>
-        <w:tblPrEx>
-          <w:tblCellMar>
-            <w:top w:w="0" w:type="dxa"/>
-            <w:bottom w:w="0" w:type="dxa"/>
-          </w:tblCellMar>
-        </w:tblPrEx>
         <w:trPr>
           <w:cantSplit/>
         </w:trPr>
@@ -3858,12 +3768,6 @@
         </w:tc>
       </w:tr>
       <w:tr>
-        <w:tblPrEx>
-          <w:tblCellMar>
-            <w:top w:w="0" w:type="dxa"/>
-            <w:bottom w:w="0" w:type="dxa"/>
-          </w:tblCellMar>
-        </w:tblPrEx>
         <w:trPr>
           <w:cantSplit/>
         </w:trPr>
@@ -3915,12 +3819,6 @@
         </w:tc>
       </w:tr>
       <w:tr>
-        <w:tblPrEx>
-          <w:tblCellMar>
-            <w:top w:w="0" w:type="dxa"/>
-            <w:bottom w:w="0" w:type="dxa"/>
-          </w:tblCellMar>
-        </w:tblPrEx>
         <w:trPr>
           <w:cantSplit/>
         </w:trPr>
@@ -3972,12 +3870,6 @@
         </w:tc>
       </w:tr>
       <w:tr>
-        <w:tblPrEx>
-          <w:tblCellMar>
-            <w:top w:w="0" w:type="dxa"/>
-            <w:bottom w:w="0" w:type="dxa"/>
-          </w:tblCellMar>
-        </w:tblPrEx>
         <w:trPr>
           <w:cantSplit/>
         </w:trPr>
@@ -4029,12 +3921,6 @@
         </w:tc>
       </w:tr>
       <w:tr>
-        <w:tblPrEx>
-          <w:tblCellMar>
-            <w:top w:w="0" w:type="dxa"/>
-            <w:bottom w:w="0" w:type="dxa"/>
-          </w:tblCellMar>
-        </w:tblPrEx>
         <w:trPr>
           <w:cantSplit/>
         </w:trPr>
@@ -4086,12 +3972,6 @@
         </w:tc>
       </w:tr>
       <w:tr>
-        <w:tblPrEx>
-          <w:tblCellMar>
-            <w:top w:w="0" w:type="dxa"/>
-            <w:bottom w:w="0" w:type="dxa"/>
-          </w:tblCellMar>
-        </w:tblPrEx>
         <w:trPr>
           <w:cantSplit/>
         </w:trPr>
@@ -4143,12 +4023,6 @@
         </w:tc>
       </w:tr>
       <w:tr>
-        <w:tblPrEx>
-          <w:tblCellMar>
-            <w:top w:w="0" w:type="dxa"/>
-            <w:bottom w:w="0" w:type="dxa"/>
-          </w:tblCellMar>
-        </w:tblPrEx>
         <w:trPr>
           <w:cantSplit/>
         </w:trPr>
@@ -4356,12 +4230,6 @@
         <w:gridCol w:w="3480"/>
       </w:tblGrid>
       <w:tr>
-        <w:tblPrEx>
-          <w:tblCellMar>
-            <w:top w:w="0" w:type="dxa"/>
-            <w:bottom w:w="0" w:type="dxa"/>
-          </w:tblCellMar>
-        </w:tblPrEx>
         <w:trPr>
           <w:tblHeader/>
         </w:trPr>
@@ -4445,12 +4313,6 @@
         </w:tc>
       </w:tr>
       <w:tr>
-        <w:tblPrEx>
-          <w:tblCellMar>
-            <w:top w:w="0" w:type="dxa"/>
-            <w:bottom w:w="0" w:type="dxa"/>
-          </w:tblCellMar>
-        </w:tblPrEx>
         <w:trPr>
           <w:cantSplit/>
         </w:trPr>
@@ -4525,12 +4387,6 @@
         </w:tc>
       </w:tr>
       <w:tr>
-        <w:tblPrEx>
-          <w:tblCellMar>
-            <w:top w:w="0" w:type="dxa"/>
-            <w:bottom w:w="0" w:type="dxa"/>
-          </w:tblCellMar>
-        </w:tblPrEx>
         <w:trPr>
           <w:cantSplit/>
         </w:trPr>
@@ -4605,12 +4461,6 @@
         </w:tc>
       </w:tr>
       <w:tr>
-        <w:tblPrEx>
-          <w:tblCellMar>
-            <w:top w:w="0" w:type="dxa"/>
-            <w:bottom w:w="0" w:type="dxa"/>
-          </w:tblCellMar>
-        </w:tblPrEx>
         <w:trPr>
           <w:cantSplit/>
         </w:trPr>
@@ -4685,12 +4535,6 @@
         </w:tc>
       </w:tr>
       <w:tr>
-        <w:tblPrEx>
-          <w:tblCellMar>
-            <w:top w:w="0" w:type="dxa"/>
-            <w:bottom w:w="0" w:type="dxa"/>
-          </w:tblCellMar>
-        </w:tblPrEx>
         <w:trPr>
           <w:cantSplit/>
         </w:trPr>
@@ -4765,12 +4609,6 @@
         </w:tc>
       </w:tr>
       <w:tr>
-        <w:tblPrEx>
-          <w:tblCellMar>
-            <w:top w:w="0" w:type="dxa"/>
-            <w:bottom w:w="0" w:type="dxa"/>
-          </w:tblCellMar>
-        </w:tblPrEx>
         <w:trPr>
           <w:cantSplit/>
         </w:trPr>
@@ -4845,12 +4683,6 @@
         </w:tc>
       </w:tr>
       <w:tr>
-        <w:tblPrEx>
-          <w:tblCellMar>
-            <w:top w:w="0" w:type="dxa"/>
-            <w:bottom w:w="0" w:type="dxa"/>
-          </w:tblCellMar>
-        </w:tblPrEx>
         <w:trPr>
           <w:cantSplit/>
         </w:trPr>
@@ -4925,12 +4757,6 @@
         </w:tc>
       </w:tr>
       <w:tr>
-        <w:tblPrEx>
-          <w:tblCellMar>
-            <w:top w:w="0" w:type="dxa"/>
-            <w:bottom w:w="0" w:type="dxa"/>
-          </w:tblCellMar>
-        </w:tblPrEx>
         <w:trPr>
           <w:cantSplit/>
         </w:trPr>
@@ -5656,12 +5482,6 @@
         <w:gridCol w:w="3560"/>
       </w:tblGrid>
       <w:tr>
-        <w:tblPrEx>
-          <w:tblCellMar>
-            <w:top w:w="0" w:type="dxa"/>
-            <w:bottom w:w="0" w:type="dxa"/>
-          </w:tblCellMar>
-        </w:tblPrEx>
         <w:trPr>
           <w:tblHeader/>
         </w:trPr>
@@ -5745,12 +5565,6 @@
         </w:tc>
       </w:tr>
       <w:tr>
-        <w:tblPrEx>
-          <w:tblCellMar>
-            <w:top w:w="0" w:type="dxa"/>
-            <w:bottom w:w="0" w:type="dxa"/>
-          </w:tblCellMar>
-        </w:tblPrEx>
         <w:trPr>
           <w:cantSplit/>
         </w:trPr>
@@ -5825,12 +5639,6 @@
         </w:tc>
       </w:tr>
       <w:tr>
-        <w:tblPrEx>
-          <w:tblCellMar>
-            <w:top w:w="0" w:type="dxa"/>
-            <w:bottom w:w="0" w:type="dxa"/>
-          </w:tblCellMar>
-        </w:tblPrEx>
         <w:trPr>
           <w:cantSplit/>
         </w:trPr>
@@ -5905,12 +5713,6 @@
         </w:tc>
       </w:tr>
       <w:tr>
-        <w:tblPrEx>
-          <w:tblCellMar>
-            <w:top w:w="0" w:type="dxa"/>
-            <w:bottom w:w="0" w:type="dxa"/>
-          </w:tblCellMar>
-        </w:tblPrEx>
         <w:trPr>
           <w:cantSplit/>
         </w:trPr>
@@ -5985,12 +5787,6 @@
         </w:tc>
       </w:tr>
       <w:tr>
-        <w:tblPrEx>
-          <w:tblCellMar>
-            <w:top w:w="0" w:type="dxa"/>
-            <w:bottom w:w="0" w:type="dxa"/>
-          </w:tblCellMar>
-        </w:tblPrEx>
         <w:trPr>
           <w:cantSplit/>
         </w:trPr>
@@ -6065,12 +5861,6 @@
         </w:tc>
       </w:tr>
       <w:tr>
-        <w:tblPrEx>
-          <w:tblCellMar>
-            <w:top w:w="0" w:type="dxa"/>
-            <w:bottom w:w="0" w:type="dxa"/>
-          </w:tblCellMar>
-        </w:tblPrEx>
         <w:trPr>
           <w:cantSplit/>
         </w:trPr>
@@ -6270,12 +6060,6 @@
         <w:gridCol w:w="6960"/>
       </w:tblGrid>
       <w:tr>
-        <w:tblPrEx>
-          <w:tblCellMar>
-            <w:top w:w="0" w:type="dxa"/>
-            <w:bottom w:w="0" w:type="dxa"/>
-          </w:tblCellMar>
-        </w:tblPrEx>
         <w:trPr>
           <w:tblHeader/>
         </w:trPr>
@@ -6333,12 +6117,6 @@
         </w:tc>
       </w:tr>
       <w:tr>
-        <w:tblPrEx>
-          <w:tblCellMar>
-            <w:top w:w="0" w:type="dxa"/>
-            <w:bottom w:w="0" w:type="dxa"/>
-          </w:tblCellMar>
-        </w:tblPrEx>
         <w:trPr>
           <w:cantSplit/>
         </w:trPr>
@@ -6390,12 +6168,6 @@
         </w:tc>
       </w:tr>
       <w:tr>
-        <w:tblPrEx>
-          <w:tblCellMar>
-            <w:top w:w="0" w:type="dxa"/>
-            <w:bottom w:w="0" w:type="dxa"/>
-          </w:tblCellMar>
-        </w:tblPrEx>
         <w:trPr>
           <w:cantSplit/>
         </w:trPr>
@@ -6447,12 +6219,6 @@
         </w:tc>
       </w:tr>
       <w:tr>
-        <w:tblPrEx>
-          <w:tblCellMar>
-            <w:top w:w="0" w:type="dxa"/>
-            <w:bottom w:w="0" w:type="dxa"/>
-          </w:tblCellMar>
-        </w:tblPrEx>
         <w:trPr>
           <w:cantSplit/>
         </w:trPr>
@@ -6504,12 +6270,6 @@
         </w:tc>
       </w:tr>
       <w:tr>
-        <w:tblPrEx>
-          <w:tblCellMar>
-            <w:top w:w="0" w:type="dxa"/>
-            <w:bottom w:w="0" w:type="dxa"/>
-          </w:tblCellMar>
-        </w:tblPrEx>
         <w:trPr>
           <w:cantSplit/>
         </w:trPr>
@@ -6561,12 +6321,6 @@
         </w:tc>
       </w:tr>
       <w:tr>
-        <w:tblPrEx>
-          <w:tblCellMar>
-            <w:top w:w="0" w:type="dxa"/>
-            <w:bottom w:w="0" w:type="dxa"/>
-          </w:tblCellMar>
-        </w:tblPrEx>
         <w:trPr>
           <w:cantSplit/>
         </w:trPr>
@@ -6618,12 +6372,6 @@
         </w:tc>
       </w:tr>
       <w:tr>
-        <w:tblPrEx>
-          <w:tblCellMar>
-            <w:top w:w="0" w:type="dxa"/>
-            <w:bottom w:w="0" w:type="dxa"/>
-          </w:tblCellMar>
-        </w:tblPrEx>
         <w:trPr>
           <w:cantSplit/>
         </w:trPr>
@@ -6675,12 +6423,6 @@
         </w:tc>
       </w:tr>
       <w:tr>
-        <w:tblPrEx>
-          <w:tblCellMar>
-            <w:top w:w="0" w:type="dxa"/>
-            <w:bottom w:w="0" w:type="dxa"/>
-          </w:tblCellMar>
-        </w:tblPrEx>
         <w:trPr>
           <w:cantSplit/>
         </w:trPr>
@@ -6732,12 +6474,6 @@
         </w:tc>
       </w:tr>
       <w:tr>
-        <w:tblPrEx>
-          <w:tblCellMar>
-            <w:top w:w="0" w:type="dxa"/>
-            <w:bottom w:w="0" w:type="dxa"/>
-          </w:tblCellMar>
-        </w:tblPrEx>
         <w:trPr>
           <w:cantSplit/>
         </w:trPr>
@@ -6846,12 +6582,6 @@
         <w:gridCol w:w="6960"/>
       </w:tblGrid>
       <w:tr>
-        <w:tblPrEx>
-          <w:tblCellMar>
-            <w:top w:w="0" w:type="dxa"/>
-            <w:bottom w:w="0" w:type="dxa"/>
-          </w:tblCellMar>
-        </w:tblPrEx>
         <w:trPr>
           <w:tblHeader/>
         </w:trPr>
@@ -6909,12 +6639,6 @@
         </w:tc>
       </w:tr>
       <w:tr>
-        <w:tblPrEx>
-          <w:tblCellMar>
-            <w:top w:w="0" w:type="dxa"/>
-            <w:bottom w:w="0" w:type="dxa"/>
-          </w:tblCellMar>
-        </w:tblPrEx>
         <w:trPr>
           <w:cantSplit/>
         </w:trPr>
@@ -6966,12 +6690,6 @@
         </w:tc>
       </w:tr>
       <w:tr>
-        <w:tblPrEx>
-          <w:tblCellMar>
-            <w:top w:w="0" w:type="dxa"/>
-            <w:bottom w:w="0" w:type="dxa"/>
-          </w:tblCellMar>
-        </w:tblPrEx>
         <w:trPr>
           <w:cantSplit/>
         </w:trPr>
@@ -7023,12 +6741,6 @@
         </w:tc>
       </w:tr>
       <w:tr>
-        <w:tblPrEx>
-          <w:tblCellMar>
-            <w:top w:w="0" w:type="dxa"/>
-            <w:bottom w:w="0" w:type="dxa"/>
-          </w:tblCellMar>
-        </w:tblPrEx>
         <w:trPr>
           <w:cantSplit/>
         </w:trPr>
@@ -7117,12 +6829,6 @@
         <w:gridCol w:w="6960"/>
       </w:tblGrid>
       <w:tr>
-        <w:tblPrEx>
-          <w:tblCellMar>
-            <w:top w:w="0" w:type="dxa"/>
-            <w:bottom w:w="0" w:type="dxa"/>
-          </w:tblCellMar>
-        </w:tblPrEx>
         <w:trPr>
           <w:tblHeader/>
         </w:trPr>
@@ -7180,12 +6886,6 @@
         </w:tc>
       </w:tr>
       <w:tr>
-        <w:tblPrEx>
-          <w:tblCellMar>
-            <w:top w:w="0" w:type="dxa"/>
-            <w:bottom w:w="0" w:type="dxa"/>
-          </w:tblCellMar>
-        </w:tblPrEx>
         <w:trPr>
           <w:cantSplit/>
         </w:trPr>
@@ -7237,12 +6937,6 @@
         </w:tc>
       </w:tr>
       <w:tr>
-        <w:tblPrEx>
-          <w:tblCellMar>
-            <w:top w:w="0" w:type="dxa"/>
-            <w:bottom w:w="0" w:type="dxa"/>
-          </w:tblCellMar>
-        </w:tblPrEx>
         <w:trPr>
           <w:cantSplit/>
         </w:trPr>
@@ -7295,12 +6989,6 @@
         </w:tc>
       </w:tr>
       <w:tr>
-        <w:tblPrEx>
-          <w:tblCellMar>
-            <w:top w:w="0" w:type="dxa"/>
-            <w:bottom w:w="0" w:type="dxa"/>
-          </w:tblCellMar>
-        </w:tblPrEx>
         <w:trPr>
           <w:cantSplit/>
         </w:trPr>
@@ -7352,12 +7040,6 @@
         </w:tc>
       </w:tr>
       <w:tr>
-        <w:tblPrEx>
-          <w:tblCellMar>
-            <w:top w:w="0" w:type="dxa"/>
-            <w:bottom w:w="0" w:type="dxa"/>
-          </w:tblCellMar>
-        </w:tblPrEx>
         <w:trPr>
           <w:cantSplit/>
         </w:trPr>
@@ -7409,12 +7091,6 @@
         </w:tc>
       </w:tr>
       <w:tr>
-        <w:tblPrEx>
-          <w:tblCellMar>
-            <w:top w:w="0" w:type="dxa"/>
-            <w:bottom w:w="0" w:type="dxa"/>
-          </w:tblCellMar>
-        </w:tblPrEx>
         <w:trPr>
           <w:cantSplit/>
         </w:trPr>
@@ -7466,12 +7142,6 @@
         </w:tc>
       </w:tr>
       <w:tr>
-        <w:tblPrEx>
-          <w:tblCellMar>
-            <w:top w:w="0" w:type="dxa"/>
-            <w:bottom w:w="0" w:type="dxa"/>
-          </w:tblCellMar>
-        </w:tblPrEx>
         <w:trPr>
           <w:cantSplit/>
         </w:trPr>
@@ -7580,12 +7250,6 @@
         <w:gridCol w:w="6960"/>
       </w:tblGrid>
       <w:tr>
-        <w:tblPrEx>
-          <w:tblCellMar>
-            <w:top w:w="0" w:type="dxa"/>
-            <w:bottom w:w="0" w:type="dxa"/>
-          </w:tblCellMar>
-        </w:tblPrEx>
         <w:trPr>
           <w:tblHeader/>
         </w:trPr>
@@ -7643,12 +7307,6 @@
         </w:tc>
       </w:tr>
       <w:tr>
-        <w:tblPrEx>
-          <w:tblCellMar>
-            <w:top w:w="0" w:type="dxa"/>
-            <w:bottom w:w="0" w:type="dxa"/>
-          </w:tblCellMar>
-        </w:tblPrEx>
         <w:trPr>
           <w:cantSplit/>
         </w:trPr>
@@ -7700,12 +7358,6 @@
         </w:tc>
       </w:tr>
       <w:tr>
-        <w:tblPrEx>
-          <w:tblCellMar>
-            <w:top w:w="0" w:type="dxa"/>
-            <w:bottom w:w="0" w:type="dxa"/>
-          </w:tblCellMar>
-        </w:tblPrEx>
         <w:trPr>
           <w:cantSplit/>
         </w:trPr>
@@ -7757,12 +7409,6 @@
         </w:tc>
       </w:tr>
       <w:tr>
-        <w:tblPrEx>
-          <w:tblCellMar>
-            <w:top w:w="0" w:type="dxa"/>
-            <w:bottom w:w="0" w:type="dxa"/>
-          </w:tblCellMar>
-        </w:tblPrEx>
         <w:trPr>
           <w:cantSplit/>
         </w:trPr>
@@ -7814,12 +7460,6 @@
         </w:tc>
       </w:tr>
       <w:tr>
-        <w:tblPrEx>
-          <w:tblCellMar>
-            <w:top w:w="0" w:type="dxa"/>
-            <w:bottom w:w="0" w:type="dxa"/>
-          </w:tblCellMar>
-        </w:tblPrEx>
         <w:trPr>
           <w:cantSplit/>
         </w:trPr>
@@ -7871,12 +7511,6 @@
         </w:tc>
       </w:tr>
       <w:tr>
-        <w:tblPrEx>
-          <w:tblCellMar>
-            <w:top w:w="0" w:type="dxa"/>
-            <w:bottom w:w="0" w:type="dxa"/>
-          </w:tblCellMar>
-        </w:tblPrEx>
         <w:trPr>
           <w:cantSplit/>
         </w:trPr>
@@ -7965,12 +7599,6 @@
         <w:gridCol w:w="6960"/>
       </w:tblGrid>
       <w:tr>
-        <w:tblPrEx>
-          <w:tblCellMar>
-            <w:top w:w="0" w:type="dxa"/>
-            <w:bottom w:w="0" w:type="dxa"/>
-          </w:tblCellMar>
-        </w:tblPrEx>
         <w:trPr>
           <w:tblHeader/>
         </w:trPr>
@@ -8028,12 +7656,6 @@
         </w:tc>
       </w:tr>
       <w:tr>
-        <w:tblPrEx>
-          <w:tblCellMar>
-            <w:top w:w="0" w:type="dxa"/>
-            <w:bottom w:w="0" w:type="dxa"/>
-          </w:tblCellMar>
-        </w:tblPrEx>
         <w:trPr>
           <w:cantSplit/>
         </w:trPr>
@@ -8085,12 +7707,6 @@
         </w:tc>
       </w:tr>
       <w:tr>
-        <w:tblPrEx>
-          <w:tblCellMar>
-            <w:top w:w="0" w:type="dxa"/>
-            <w:bottom w:w="0" w:type="dxa"/>
-          </w:tblCellMar>
-        </w:tblPrEx>
         <w:trPr>
           <w:cantSplit/>
         </w:trPr>
@@ -8142,12 +7758,6 @@
         </w:tc>
       </w:tr>
       <w:tr>
-        <w:tblPrEx>
-          <w:tblCellMar>
-            <w:top w:w="0" w:type="dxa"/>
-            <w:bottom w:w="0" w:type="dxa"/>
-          </w:tblCellMar>
-        </w:tblPrEx>
         <w:trPr>
           <w:cantSplit/>
         </w:trPr>
@@ -8199,12 +7809,6 @@
         </w:tc>
       </w:tr>
       <w:tr>
-        <w:tblPrEx>
-          <w:tblCellMar>
-            <w:top w:w="0" w:type="dxa"/>
-            <w:bottom w:w="0" w:type="dxa"/>
-          </w:tblCellMar>
-        </w:tblPrEx>
         <w:trPr>
           <w:cantSplit/>
         </w:trPr>
@@ -8257,12 +7861,6 @@
         </w:tc>
       </w:tr>
       <w:tr>
-        <w:tblPrEx>
-          <w:tblCellMar>
-            <w:top w:w="0" w:type="dxa"/>
-            <w:bottom w:w="0" w:type="dxa"/>
-          </w:tblCellMar>
-        </w:tblPrEx>
         <w:trPr>
           <w:cantSplit/>
         </w:trPr>
@@ -8314,12 +7912,6 @@
         </w:tc>
       </w:tr>
       <w:tr>
-        <w:tblPrEx>
-          <w:tblCellMar>
-            <w:top w:w="0" w:type="dxa"/>
-            <w:bottom w:w="0" w:type="dxa"/>
-          </w:tblCellMar>
-        </w:tblPrEx>
         <w:trPr>
           <w:cantSplit/>
         </w:trPr>
@@ -8371,12 +7963,6 @@
         </w:tc>
       </w:tr>
       <w:tr>
-        <w:tblPrEx>
-          <w:tblCellMar>
-            <w:top w:w="0" w:type="dxa"/>
-            <w:bottom w:w="0" w:type="dxa"/>
-          </w:tblCellMar>
-        </w:tblPrEx>
         <w:trPr>
           <w:tblHeader/>
         </w:trPr>
@@ -8434,12 +8020,6 @@
         </w:tc>
       </w:tr>
       <w:tr>
-        <w:tblPrEx>
-          <w:tblCellMar>
-            <w:top w:w="0" w:type="dxa"/>
-            <w:bottom w:w="0" w:type="dxa"/>
-          </w:tblCellMar>
-        </w:tblPrEx>
         <w:trPr>
           <w:cantSplit/>
         </w:trPr>
@@ -8533,12 +8113,6 @@
         <w:gridCol w:w="6960"/>
       </w:tblGrid>
       <w:tr>
-        <w:tblPrEx>
-          <w:tblCellMar>
-            <w:top w:w="0" w:type="dxa"/>
-            <w:bottom w:w="0" w:type="dxa"/>
-          </w:tblCellMar>
-        </w:tblPrEx>
         <w:trPr>
           <w:tblHeader/>
         </w:trPr>
@@ -8596,12 +8170,6 @@
         </w:tc>
       </w:tr>
       <w:tr>
-        <w:tblPrEx>
-          <w:tblCellMar>
-            <w:top w:w="0" w:type="dxa"/>
-            <w:bottom w:w="0" w:type="dxa"/>
-          </w:tblCellMar>
-        </w:tblPrEx>
         <w:trPr>
           <w:cantSplit/>
         </w:trPr>
@@ -8653,12 +8221,6 @@
         </w:tc>
       </w:tr>
       <w:tr>
-        <w:tblPrEx>
-          <w:tblCellMar>
-            <w:top w:w="0" w:type="dxa"/>
-            <w:bottom w:w="0" w:type="dxa"/>
-          </w:tblCellMar>
-        </w:tblPrEx>
         <w:trPr>
           <w:cantSplit/>
         </w:trPr>
@@ -8710,12 +8272,6 @@
         </w:tc>
       </w:tr>
       <w:tr>
-        <w:tblPrEx>
-          <w:tblCellMar>
-            <w:top w:w="0" w:type="dxa"/>
-            <w:bottom w:w="0" w:type="dxa"/>
-          </w:tblCellMar>
-        </w:tblPrEx>
         <w:trPr>
           <w:cantSplit/>
         </w:trPr>
@@ -8767,12 +8323,6 @@
         </w:tc>
       </w:tr>
       <w:tr>
-        <w:tblPrEx>
-          <w:tblCellMar>
-            <w:top w:w="0" w:type="dxa"/>
-            <w:bottom w:w="0" w:type="dxa"/>
-          </w:tblCellMar>
-        </w:tblPrEx>
         <w:trPr>
           <w:cantSplit/>
         </w:trPr>
@@ -8824,12 +8374,6 @@
         </w:tc>
       </w:tr>
       <w:tr>
-        <w:tblPrEx>
-          <w:tblCellMar>
-            <w:top w:w="0" w:type="dxa"/>
-            <w:bottom w:w="0" w:type="dxa"/>
-          </w:tblCellMar>
-        </w:tblPrEx>
         <w:trPr>
           <w:cantSplit/>
         </w:trPr>
@@ -9070,12 +8614,6 @@
         <w:gridCol w:w="6960"/>
       </w:tblGrid>
       <w:tr>
-        <w:tblPrEx>
-          <w:tblCellMar>
-            <w:top w:w="0" w:type="dxa"/>
-            <w:bottom w:w="0" w:type="dxa"/>
-          </w:tblCellMar>
-        </w:tblPrEx>
         <w:trPr>
           <w:tblHeader/>
         </w:trPr>
@@ -9133,12 +8671,6 @@
         </w:tc>
       </w:tr>
       <w:tr>
-        <w:tblPrEx>
-          <w:tblCellMar>
-            <w:top w:w="0" w:type="dxa"/>
-            <w:bottom w:w="0" w:type="dxa"/>
-          </w:tblCellMar>
-        </w:tblPrEx>
         <w:trPr>
           <w:cantSplit/>
         </w:trPr>
@@ -9190,12 +8722,6 @@
         </w:tc>
       </w:tr>
       <w:tr>
-        <w:tblPrEx>
-          <w:tblCellMar>
-            <w:top w:w="0" w:type="dxa"/>
-            <w:bottom w:w="0" w:type="dxa"/>
-          </w:tblCellMar>
-        </w:tblPrEx>
         <w:trPr>
           <w:cantSplit/>
         </w:trPr>
@@ -9247,12 +8773,6 @@
         </w:tc>
       </w:tr>
       <w:tr>
-        <w:tblPrEx>
-          <w:tblCellMar>
-            <w:top w:w="0" w:type="dxa"/>
-            <w:bottom w:w="0" w:type="dxa"/>
-          </w:tblCellMar>
-        </w:tblPrEx>
         <w:trPr>
           <w:cantSplit/>
         </w:trPr>
@@ -9304,12 +8824,6 @@
         </w:tc>
       </w:tr>
       <w:tr>
-        <w:tblPrEx>
-          <w:tblCellMar>
-            <w:top w:w="0" w:type="dxa"/>
-            <w:bottom w:w="0" w:type="dxa"/>
-          </w:tblCellMar>
-        </w:tblPrEx>
         <w:trPr>
           <w:cantSplit/>
         </w:trPr>
@@ -9427,12 +8941,6 @@
         <w:gridCol w:w="3360"/>
       </w:tblGrid>
       <w:tr>
-        <w:tblPrEx>
-          <w:tblCellMar>
-            <w:top w:w="0" w:type="dxa"/>
-            <w:bottom w:w="0" w:type="dxa"/>
-          </w:tblCellMar>
-        </w:tblPrEx>
         <w:trPr>
           <w:tblHeader/>
         </w:trPr>
@@ -9516,12 +9024,6 @@
         </w:tc>
       </w:tr>
       <w:tr>
-        <w:tblPrEx>
-          <w:tblCellMar>
-            <w:top w:w="0" w:type="dxa"/>
-            <w:bottom w:w="0" w:type="dxa"/>
-          </w:tblCellMar>
-        </w:tblPrEx>
         <w:trPr>
           <w:cantSplit/>
         </w:trPr>
@@ -9596,12 +9098,6 @@
         </w:tc>
       </w:tr>
       <w:tr>
-        <w:tblPrEx>
-          <w:tblCellMar>
-            <w:top w:w="0" w:type="dxa"/>
-            <w:bottom w:w="0" w:type="dxa"/>
-          </w:tblCellMar>
-        </w:tblPrEx>
         <w:trPr>
           <w:cantSplit/>
         </w:trPr>
@@ -9676,12 +9172,6 @@
         </w:tc>
       </w:tr>
       <w:tr>
-        <w:tblPrEx>
-          <w:tblCellMar>
-            <w:top w:w="0" w:type="dxa"/>
-            <w:bottom w:w="0" w:type="dxa"/>
-          </w:tblCellMar>
-        </w:tblPrEx>
         <w:trPr>
           <w:cantSplit/>
         </w:trPr>
@@ -9756,12 +9246,6 @@
         </w:tc>
       </w:tr>
       <w:tr>
-        <w:tblPrEx>
-          <w:tblCellMar>
-            <w:top w:w="0" w:type="dxa"/>
-            <w:bottom w:w="0" w:type="dxa"/>
-          </w:tblCellMar>
-        </w:tblPrEx>
         <w:trPr>
           <w:cantSplit/>
         </w:trPr>
@@ -9836,12 +9320,6 @@
         </w:tc>
       </w:tr>
       <w:tr>
-        <w:tblPrEx>
-          <w:tblCellMar>
-            <w:top w:w="0" w:type="dxa"/>
-            <w:bottom w:w="0" w:type="dxa"/>
-          </w:tblCellMar>
-        </w:tblPrEx>
         <w:trPr>
           <w:cantSplit/>
         </w:trPr>
@@ -9916,12 +9394,6 @@
         </w:tc>
       </w:tr>
       <w:tr>
-        <w:tblPrEx>
-          <w:tblCellMar>
-            <w:top w:w="0" w:type="dxa"/>
-            <w:bottom w:w="0" w:type="dxa"/>
-          </w:tblCellMar>
-        </w:tblPrEx>
         <w:trPr>
           <w:cantSplit/>
         </w:trPr>
@@ -10093,12 +9565,6 @@
         <w:gridCol w:w="9600"/>
       </w:tblGrid>
       <w:tr>
-        <w:tblPrEx>
-          <w:tblCellMar>
-            <w:top w:w="0" w:type="dxa"/>
-            <w:bottom w:w="0" w:type="dxa"/>
-          </w:tblCellMar>
-        </w:tblPrEx>
         <w:trPr>
           <w:cantSplit/>
           <w:jc w:val="center"/>
@@ -10562,12 +10028,6 @@
         <w:gridCol w:w="3260"/>
       </w:tblGrid>
       <w:tr>
-        <w:tblPrEx>
-          <w:tblCellMar>
-            <w:top w:w="0" w:type="dxa"/>
-            <w:bottom w:w="0" w:type="dxa"/>
-          </w:tblCellMar>
-        </w:tblPrEx>
         <w:trPr>
           <w:tblHeader/>
         </w:trPr>
@@ -10651,12 +10111,6 @@
         </w:tc>
       </w:tr>
       <w:tr>
-        <w:tblPrEx>
-          <w:tblCellMar>
-            <w:top w:w="0" w:type="dxa"/>
-            <w:bottom w:w="0" w:type="dxa"/>
-          </w:tblCellMar>
-        </w:tblPrEx>
         <w:trPr>
           <w:cantSplit/>
         </w:trPr>
@@ -10731,12 +10185,6 @@
         </w:tc>
       </w:tr>
       <w:tr>
-        <w:tblPrEx>
-          <w:tblCellMar>
-            <w:top w:w="0" w:type="dxa"/>
-            <w:bottom w:w="0" w:type="dxa"/>
-          </w:tblCellMar>
-        </w:tblPrEx>
         <w:trPr>
           <w:cantSplit/>
         </w:trPr>
@@ -10811,12 +10259,6 @@
         </w:tc>
       </w:tr>
       <w:tr>
-        <w:tblPrEx>
-          <w:tblCellMar>
-            <w:top w:w="0" w:type="dxa"/>
-            <w:bottom w:w="0" w:type="dxa"/>
-          </w:tblCellMar>
-        </w:tblPrEx>
         <w:trPr>
           <w:cantSplit/>
         </w:trPr>
@@ -10891,12 +10333,6 @@
         </w:tc>
       </w:tr>
       <w:tr>
-        <w:tblPrEx>
-          <w:tblCellMar>
-            <w:top w:w="0" w:type="dxa"/>
-            <w:bottom w:w="0" w:type="dxa"/>
-          </w:tblCellMar>
-        </w:tblPrEx>
         <w:trPr>
           <w:cantSplit/>
         </w:trPr>
@@ -10971,12 +10407,6 @@
         </w:tc>
       </w:tr>
       <w:tr>
-        <w:tblPrEx>
-          <w:tblCellMar>
-            <w:top w:w="0" w:type="dxa"/>
-            <w:bottom w:w="0" w:type="dxa"/>
-          </w:tblCellMar>
-        </w:tblPrEx>
         <w:trPr>
           <w:cantSplit/>
         </w:trPr>
@@ -11051,12 +10481,6 @@
         </w:tc>
       </w:tr>
       <w:tr>
-        <w:tblPrEx>
-          <w:tblCellMar>
-            <w:top w:w="0" w:type="dxa"/>
-            <w:bottom w:w="0" w:type="dxa"/>
-          </w:tblCellMar>
-        </w:tblPrEx>
         <w:trPr>
           <w:cantSplit/>
         </w:trPr>
@@ -11131,12 +10555,6 @@
         </w:tc>
       </w:tr>
       <w:tr>
-        <w:tblPrEx>
-          <w:tblCellMar>
-            <w:top w:w="0" w:type="dxa"/>
-            <w:bottom w:w="0" w:type="dxa"/>
-          </w:tblCellMar>
-        </w:tblPrEx>
         <w:trPr>
           <w:cantSplit/>
         </w:trPr>
@@ -11211,12 +10629,6 @@
         </w:tc>
       </w:tr>
       <w:tr>
-        <w:tblPrEx>
-          <w:tblCellMar>
-            <w:top w:w="0" w:type="dxa"/>
-            <w:bottom w:w="0" w:type="dxa"/>
-          </w:tblCellMar>
-        </w:tblPrEx>
         <w:trPr>
           <w:cantSplit/>
         </w:trPr>
@@ -11291,12 +10703,6 @@
         </w:tc>
       </w:tr>
       <w:tr>
-        <w:tblPrEx>
-          <w:tblCellMar>
-            <w:top w:w="0" w:type="dxa"/>
-            <w:bottom w:w="0" w:type="dxa"/>
-          </w:tblCellMar>
-        </w:tblPrEx>
         <w:trPr>
           <w:cantSplit/>
         </w:trPr>
@@ -11371,12 +10777,6 @@
         </w:tc>
       </w:tr>
       <w:tr>
-        <w:tblPrEx>
-          <w:tblCellMar>
-            <w:top w:w="0" w:type="dxa"/>
-            <w:bottom w:w="0" w:type="dxa"/>
-          </w:tblCellMar>
-        </w:tblPrEx>
         <w:trPr>
           <w:cantSplit/>
         </w:trPr>
@@ -11710,12 +11110,6 @@
         <w:gridCol w:w="9360"/>
       </w:tblGrid>
       <w:tr>
-        <w:tblPrEx>
-          <w:tblCellMar>
-            <w:top w:w="0" w:type="dxa"/>
-            <w:bottom w:w="0" w:type="dxa"/>
-          </w:tblCellMar>
-        </w:tblPrEx>
         <w:tc>
           <w:tcPr>
             <w:tcW w:w="9360" w:type="dxa"/>
@@ -11822,12 +11216,6 @@
         <w:gridCol w:w="6240"/>
       </w:tblGrid>
       <w:tr>
-        <w:tblPrEx>
-          <w:tblCellMar>
-            <w:top w:w="0" w:type="dxa"/>
-            <w:bottom w:w="0" w:type="dxa"/>
-          </w:tblCellMar>
-        </w:tblPrEx>
         <w:trPr>
           <w:tblHeader/>
         </w:trPr>
@@ -11886,12 +11274,6 @@
         </w:tc>
       </w:tr>
       <w:tr>
-        <w:tblPrEx>
-          <w:tblCellMar>
-            <w:top w:w="0" w:type="dxa"/>
-            <w:bottom w:w="0" w:type="dxa"/>
-          </w:tblCellMar>
-        </w:tblPrEx>
         <w:trPr>
           <w:cantSplit/>
         </w:trPr>
@@ -11943,12 +11325,6 @@
         </w:tc>
       </w:tr>
       <w:tr>
-        <w:tblPrEx>
-          <w:tblCellMar>
-            <w:top w:w="0" w:type="dxa"/>
-            <w:bottom w:w="0" w:type="dxa"/>
-          </w:tblCellMar>
-        </w:tblPrEx>
         <w:trPr>
           <w:cantSplit/>
         </w:trPr>
@@ -12000,12 +11376,6 @@
         </w:tc>
       </w:tr>
       <w:tr>
-        <w:tblPrEx>
-          <w:tblCellMar>
-            <w:top w:w="0" w:type="dxa"/>
-            <w:bottom w:w="0" w:type="dxa"/>
-          </w:tblCellMar>
-        </w:tblPrEx>
         <w:trPr>
           <w:cantSplit/>
         </w:trPr>
@@ -12057,12 +11427,6 @@
         </w:tc>
       </w:tr>
       <w:tr>
-        <w:tblPrEx>
-          <w:tblCellMar>
-            <w:top w:w="0" w:type="dxa"/>
-            <w:bottom w:w="0" w:type="dxa"/>
-          </w:tblCellMar>
-        </w:tblPrEx>
         <w:trPr>
           <w:cantSplit/>
         </w:trPr>
@@ -12148,12 +11512,6 @@
         <w:gridCol w:w="9600"/>
       </w:tblGrid>
       <w:tr>
-        <w:tblPrEx>
-          <w:tblCellMar>
-            <w:top w:w="0" w:type="dxa"/>
-            <w:bottom w:w="0" w:type="dxa"/>
-          </w:tblCellMar>
-        </w:tblPrEx>
         <w:trPr>
           <w:cantSplit/>
           <w:jc w:val="center"/>
@@ -12384,12 +11742,6 @@
         <w:gridCol w:w="3980"/>
       </w:tblGrid>
       <w:tr>
-        <w:tblPrEx>
-          <w:tblCellMar>
-            <w:top w:w="0" w:type="dxa"/>
-            <w:bottom w:w="0" w:type="dxa"/>
-          </w:tblCellMar>
-        </w:tblPrEx>
         <w:trPr>
           <w:tblHeader/>
         </w:trPr>
@@ -12473,12 +11825,6 @@
         </w:tc>
       </w:tr>
       <w:tr>
-        <w:tblPrEx>
-          <w:tblCellMar>
-            <w:top w:w="0" w:type="dxa"/>
-            <w:bottom w:w="0" w:type="dxa"/>
-          </w:tblCellMar>
-        </w:tblPrEx>
         <w:trPr>
           <w:cantSplit/>
         </w:trPr>
@@ -12553,12 +11899,6 @@
         </w:tc>
       </w:tr>
       <w:tr>
-        <w:tblPrEx>
-          <w:tblCellMar>
-            <w:top w:w="0" w:type="dxa"/>
-            <w:bottom w:w="0" w:type="dxa"/>
-          </w:tblCellMar>
-        </w:tblPrEx>
         <w:trPr>
           <w:cantSplit/>
         </w:trPr>
@@ -12633,12 +11973,6 @@
         </w:tc>
       </w:tr>
       <w:tr>
-        <w:tblPrEx>
-          <w:tblCellMar>
-            <w:top w:w="0" w:type="dxa"/>
-            <w:bottom w:w="0" w:type="dxa"/>
-          </w:tblCellMar>
-        </w:tblPrEx>
         <w:trPr>
           <w:cantSplit/>
         </w:trPr>
@@ -12910,12 +12244,6 @@
         <w:gridCol w:w="9600"/>
       </w:tblGrid>
       <w:tr>
-        <w:tblPrEx>
-          <w:tblCellMar>
-            <w:top w:w="0" w:type="dxa"/>
-            <w:bottom w:w="0" w:type="dxa"/>
-          </w:tblCellMar>
-        </w:tblPrEx>
         <w:trPr>
           <w:cantSplit/>
           <w:jc w:val="center"/>
@@ -13041,12 +12369,6 @@
         <w:gridCol w:w="7160"/>
       </w:tblGrid>
       <w:tr>
-        <w:tblPrEx>
-          <w:tblCellMar>
-            <w:top w:w="0" w:type="dxa"/>
-            <w:bottom w:w="0" w:type="dxa"/>
-          </w:tblCellMar>
-        </w:tblPrEx>
         <w:trPr>
           <w:tblHeader/>
         </w:trPr>
@@ -13104,12 +12426,6 @@
         </w:tc>
       </w:tr>
       <w:tr>
-        <w:tblPrEx>
-          <w:tblCellMar>
-            <w:top w:w="0" w:type="dxa"/>
-            <w:bottom w:w="0" w:type="dxa"/>
-          </w:tblCellMar>
-        </w:tblPrEx>
         <w:trPr>
           <w:cantSplit/>
         </w:trPr>
@@ -13161,12 +12477,6 @@
         </w:tc>
       </w:tr>
       <w:tr>
-        <w:tblPrEx>
-          <w:tblCellMar>
-            <w:top w:w="0" w:type="dxa"/>
-            <w:bottom w:w="0" w:type="dxa"/>
-          </w:tblCellMar>
-        </w:tblPrEx>
         <w:trPr>
           <w:cantSplit/>
         </w:trPr>
@@ -13218,12 +12528,6 @@
         </w:tc>
       </w:tr>
       <w:tr>
-        <w:tblPrEx>
-          <w:tblCellMar>
-            <w:top w:w="0" w:type="dxa"/>
-            <w:bottom w:w="0" w:type="dxa"/>
-          </w:tblCellMar>
-        </w:tblPrEx>
         <w:trPr>
           <w:cantSplit/>
         </w:trPr>
@@ -13275,12 +12579,6 @@
         </w:tc>
       </w:tr>
       <w:tr>
-        <w:tblPrEx>
-          <w:tblCellMar>
-            <w:top w:w="0" w:type="dxa"/>
-            <w:bottom w:w="0" w:type="dxa"/>
-          </w:tblCellMar>
-        </w:tblPrEx>
         <w:trPr>
           <w:cantSplit/>
         </w:trPr>
@@ -13332,12 +12630,6 @@
         </w:tc>
       </w:tr>
       <w:tr>
-        <w:tblPrEx>
-          <w:tblCellMar>
-            <w:top w:w="0" w:type="dxa"/>
-            <w:bottom w:w="0" w:type="dxa"/>
-          </w:tblCellMar>
-        </w:tblPrEx>
         <w:trPr>
           <w:cantSplit/>
         </w:trPr>
@@ -13428,12 +12720,6 @@
         <w:gridCol w:w="4680"/>
       </w:tblGrid>
       <w:tr>
-        <w:tblPrEx>
-          <w:tblCellMar>
-            <w:top w:w="0" w:type="dxa"/>
-            <w:bottom w:w="0" w:type="dxa"/>
-          </w:tblCellMar>
-        </w:tblPrEx>
         <w:trPr>
           <w:tblHeader/>
         </w:trPr>
@@ -13517,12 +12803,6 @@
         </w:tc>
       </w:tr>
       <w:tr>
-        <w:tblPrEx>
-          <w:tblCellMar>
-            <w:top w:w="0" w:type="dxa"/>
-            <w:bottom w:w="0" w:type="dxa"/>
-          </w:tblCellMar>
-        </w:tblPrEx>
         <w:trPr>
           <w:cantSplit/>
         </w:trPr>
@@ -13597,12 +12877,6 @@
         </w:tc>
       </w:tr>
       <w:tr>
-        <w:tblPrEx>
-          <w:tblCellMar>
-            <w:top w:w="0" w:type="dxa"/>
-            <w:bottom w:w="0" w:type="dxa"/>
-          </w:tblCellMar>
-        </w:tblPrEx>
         <w:trPr>
           <w:cantSplit/>
         </w:trPr>
@@ -13677,12 +12951,6 @@
         </w:tc>
       </w:tr>
       <w:tr>
-        <w:tblPrEx>
-          <w:tblCellMar>
-            <w:top w:w="0" w:type="dxa"/>
-            <w:bottom w:w="0" w:type="dxa"/>
-          </w:tblCellMar>
-        </w:tblPrEx>
         <w:trPr>
           <w:cantSplit/>
         </w:trPr>
@@ -13757,12 +13025,6 @@
         </w:tc>
       </w:tr>
       <w:tr>
-        <w:tblPrEx>
-          <w:tblCellMar>
-            <w:top w:w="0" w:type="dxa"/>
-            <w:bottom w:w="0" w:type="dxa"/>
-          </w:tblCellMar>
-        </w:tblPrEx>
         <w:trPr>
           <w:cantSplit/>
         </w:trPr>
@@ -13837,12 +13099,6 @@
         </w:tc>
       </w:tr>
       <w:tr>
-        <w:tblPrEx>
-          <w:tblCellMar>
-            <w:top w:w="0" w:type="dxa"/>
-            <w:bottom w:w="0" w:type="dxa"/>
-          </w:tblCellMar>
-        </w:tblPrEx>
         <w:trPr>
           <w:cantSplit/>
         </w:trPr>
@@ -13917,12 +13173,6 @@
         </w:tc>
       </w:tr>
       <w:tr>
-        <w:tblPrEx>
-          <w:tblCellMar>
-            <w:top w:w="0" w:type="dxa"/>
-            <w:bottom w:w="0" w:type="dxa"/>
-          </w:tblCellMar>
-        </w:tblPrEx>
         <w:trPr>
           <w:cantSplit/>
         </w:trPr>
@@ -13997,12 +13247,6 @@
         </w:tc>
       </w:tr>
       <w:tr>
-        <w:tblPrEx>
-          <w:tblCellMar>
-            <w:top w:w="0" w:type="dxa"/>
-            <w:bottom w:w="0" w:type="dxa"/>
-          </w:tblCellMar>
-        </w:tblPrEx>
         <w:trPr>
           <w:cantSplit/>
         </w:trPr>
@@ -14418,12 +13662,6 @@
         <w:gridCol w:w="3260"/>
       </w:tblGrid>
       <w:tr>
-        <w:tblPrEx>
-          <w:tblCellMar>
-            <w:top w:w="0" w:type="dxa"/>
-            <w:bottom w:w="0" w:type="dxa"/>
-          </w:tblCellMar>
-        </w:tblPrEx>
         <w:trPr>
           <w:tblHeader/>
         </w:trPr>
@@ -14507,12 +13745,6 @@
         </w:tc>
       </w:tr>
       <w:tr>
-        <w:tblPrEx>
-          <w:tblCellMar>
-            <w:top w:w="0" w:type="dxa"/>
-            <w:bottom w:w="0" w:type="dxa"/>
-          </w:tblCellMar>
-        </w:tblPrEx>
         <w:trPr>
           <w:cantSplit/>
         </w:trPr>
@@ -14587,12 +13819,6 @@
         </w:tc>
       </w:tr>
       <w:tr>
-        <w:tblPrEx>
-          <w:tblCellMar>
-            <w:top w:w="0" w:type="dxa"/>
-            <w:bottom w:w="0" w:type="dxa"/>
-          </w:tblCellMar>
-        </w:tblPrEx>
         <w:trPr>
           <w:cantSplit/>
         </w:trPr>
@@ -14667,12 +13893,6 @@
         </w:tc>
       </w:tr>
       <w:tr>
-        <w:tblPrEx>
-          <w:tblCellMar>
-            <w:top w:w="0" w:type="dxa"/>
-            <w:bottom w:w="0" w:type="dxa"/>
-          </w:tblCellMar>
-        </w:tblPrEx>
         <w:trPr>
           <w:cantSplit/>
         </w:trPr>
@@ -14747,12 +13967,6 @@
         </w:tc>
       </w:tr>
       <w:tr>
-        <w:tblPrEx>
-          <w:tblCellMar>
-            <w:top w:w="0" w:type="dxa"/>
-            <w:bottom w:w="0" w:type="dxa"/>
-          </w:tblCellMar>
-        </w:tblPrEx>
         <w:trPr>
           <w:cantSplit/>
         </w:trPr>
@@ -14827,12 +14041,6 @@
         </w:tc>
       </w:tr>
       <w:tr>
-        <w:tblPrEx>
-          <w:tblCellMar>
-            <w:top w:w="0" w:type="dxa"/>
-            <w:bottom w:w="0" w:type="dxa"/>
-          </w:tblCellMar>
-        </w:tblPrEx>
         <w:trPr>
           <w:cantSplit/>
         </w:trPr>
@@ -14907,12 +14115,6 @@
         </w:tc>
       </w:tr>
       <w:tr>
-        <w:tblPrEx>
-          <w:tblCellMar>
-            <w:top w:w="0" w:type="dxa"/>
-            <w:bottom w:w="0" w:type="dxa"/>
-          </w:tblCellMar>
-        </w:tblPrEx>
         <w:trPr>
           <w:cantSplit/>
         </w:trPr>
@@ -14987,12 +14189,6 @@
         </w:tc>
       </w:tr>
       <w:tr>
-        <w:tblPrEx>
-          <w:tblCellMar>
-            <w:top w:w="0" w:type="dxa"/>
-            <w:bottom w:w="0" w:type="dxa"/>
-          </w:tblCellMar>
-        </w:tblPrEx>
         <w:trPr>
           <w:cantSplit/>
         </w:trPr>
@@ -15067,12 +14263,6 @@
         </w:tc>
       </w:tr>
       <w:tr>
-        <w:tblPrEx>
-          <w:tblCellMar>
-            <w:top w:w="0" w:type="dxa"/>
-            <w:bottom w:w="0" w:type="dxa"/>
-          </w:tblCellMar>
-        </w:tblPrEx>
         <w:trPr>
           <w:cantSplit/>
         </w:trPr>
@@ -15147,12 +14337,6 @@
         </w:tc>
       </w:tr>
       <w:tr>
-        <w:tblPrEx>
-          <w:tblCellMar>
-            <w:top w:w="0" w:type="dxa"/>
-            <w:bottom w:w="0" w:type="dxa"/>
-          </w:tblCellMar>
-        </w:tblPrEx>
         <w:trPr>
           <w:cantSplit/>
         </w:trPr>
@@ -15278,12 +14462,6 @@
         <w:gridCol w:w="3260"/>
       </w:tblGrid>
       <w:tr>
-        <w:tblPrEx>
-          <w:tblCellMar>
-            <w:top w:w="0" w:type="dxa"/>
-            <w:bottom w:w="0" w:type="dxa"/>
-          </w:tblCellMar>
-        </w:tblPrEx>
         <w:trPr>
           <w:tblHeader/>
         </w:trPr>
@@ -15367,12 +14545,6 @@
         </w:tc>
       </w:tr>
       <w:tr>
-        <w:tblPrEx>
-          <w:tblCellMar>
-            <w:top w:w="0" w:type="dxa"/>
-            <w:bottom w:w="0" w:type="dxa"/>
-          </w:tblCellMar>
-        </w:tblPrEx>
         <w:trPr>
           <w:cantSplit/>
         </w:trPr>
@@ -15441,18 +14613,28 @@
                 <w:sz w:val="20"/>
                 <w:szCs w:val="20"/>
               </w:rPr>
-              <w:t>2 uses per run (worn spring)</w:t>
+              <w:t xml:space="preserve">2 uses per run </w:t>
+            </w:r>
+            <w:r>
+              <w:rPr>
+                <w:rFonts w:ascii="Arial" w:eastAsia="Arial" w:hAnsi="Arial" w:cs="Arial"/>
+                <w:sz w:val="20"/>
+                <w:szCs w:val="20"/>
+              </w:rPr>
+              <w:t>(only 2 in the house</w:t>
+            </w:r>
+            <w:r>
+              <w:rPr>
+                <w:rFonts w:ascii="Arial" w:eastAsia="Arial" w:hAnsi="Arial" w:cs="Arial"/>
+                <w:sz w:val="20"/>
+                <w:szCs w:val="20"/>
+              </w:rPr>
+              <w:t>)</w:t>
             </w:r>
           </w:p>
         </w:tc>
       </w:tr>
       <w:tr>
-        <w:tblPrEx>
-          <w:tblCellMar>
-            <w:top w:w="0" w:type="dxa"/>
-            <w:bottom w:w="0" w:type="dxa"/>
-          </w:tblCellMar>
-        </w:tblPrEx>
         <w:trPr>
           <w:cantSplit/>
         </w:trPr>
@@ -15521,18 +14703,28 @@
                 <w:sz w:val="20"/>
                 <w:szCs w:val="20"/>
               </w:rPr>
-              <w:t>The crank lasts 8 s; recharging makes 6 m of noise; does NOT work on Peter Pan</w:t>
+              <w:t xml:space="preserve">The crank lasts </w:t>
+            </w:r>
+            <w:r>
+              <w:rPr>
+                <w:rFonts w:ascii="Arial" w:eastAsia="Arial" w:hAnsi="Arial" w:cs="Arial"/>
+                <w:sz w:val="20"/>
+                <w:szCs w:val="20"/>
+              </w:rPr>
+              <w:t>32</w:t>
+            </w:r>
+            <w:r>
+              <w:rPr>
+                <w:rFonts w:ascii="Arial" w:eastAsia="Arial" w:hAnsi="Arial" w:cs="Arial"/>
+                <w:sz w:val="20"/>
+                <w:szCs w:val="20"/>
+              </w:rPr>
+              <w:t xml:space="preserve"> s; recharging makes 6 m of noise; does NOT work on Peter Pan</w:t>
             </w:r>
           </w:p>
         </w:tc>
       </w:tr>
       <w:tr>
-        <w:tblPrEx>
-          <w:tblCellMar>
-            <w:top w:w="0" w:type="dxa"/>
-            <w:bottom w:w="0" w:type="dxa"/>
-          </w:tblCellMar>
-        </w:tblPrEx>
         <w:trPr>
           <w:cantSplit/>
         </w:trPr>
@@ -15607,12 +14799,6 @@
         </w:tc>
       </w:tr>
       <w:tr>
-        <w:tblPrEx>
-          <w:tblCellMar>
-            <w:top w:w="0" w:type="dxa"/>
-            <w:bottom w:w="0" w:type="dxa"/>
-          </w:tblCellMar>
-        </w:tblPrEx>
         <w:trPr>
           <w:cantSplit/>
         </w:trPr>
@@ -15688,12 +14874,6 @@
         </w:tc>
       </w:tr>
       <w:tr>
-        <w:tblPrEx>
-          <w:tblCellMar>
-            <w:top w:w="0" w:type="dxa"/>
-            <w:bottom w:w="0" w:type="dxa"/>
-          </w:tblCellMar>
-        </w:tblPrEx>
         <w:trPr>
           <w:cantSplit/>
         </w:trPr>
@@ -16090,12 +15270,6 @@
         <w:gridCol w:w="1760"/>
       </w:tblGrid>
       <w:tr>
-        <w:tblPrEx>
-          <w:tblCellMar>
-            <w:top w:w="0" w:type="dxa"/>
-            <w:bottom w:w="0" w:type="dxa"/>
-          </w:tblCellMar>
-        </w:tblPrEx>
         <w:trPr>
           <w:tblHeader/>
         </w:trPr>
@@ -16205,12 +15379,6 @@
         </w:tc>
       </w:tr>
       <w:tr>
-        <w:tblPrEx>
-          <w:tblCellMar>
-            <w:top w:w="0" w:type="dxa"/>
-            <w:bottom w:w="0" w:type="dxa"/>
-          </w:tblCellMar>
-        </w:tblPrEx>
         <w:trPr>
           <w:cantSplit/>
         </w:trPr>
@@ -16308,12 +15476,6 @@
         </w:tc>
       </w:tr>
       <w:tr>
-        <w:tblPrEx>
-          <w:tblCellMar>
-            <w:top w:w="0" w:type="dxa"/>
-            <w:bottom w:w="0" w:type="dxa"/>
-          </w:tblCellMar>
-        </w:tblPrEx>
         <w:trPr>
           <w:cantSplit/>
         </w:trPr>
@@ -16411,12 +15573,6 @@
         </w:tc>
       </w:tr>
       <w:tr>
-        <w:tblPrEx>
-          <w:tblCellMar>
-            <w:top w:w="0" w:type="dxa"/>
-            <w:bottom w:w="0" w:type="dxa"/>
-          </w:tblCellMar>
-        </w:tblPrEx>
         <w:trPr>
           <w:cantSplit/>
         </w:trPr>
@@ -16514,12 +15670,6 @@
         </w:tc>
       </w:tr>
       <w:tr>
-        <w:tblPrEx>
-          <w:tblCellMar>
-            <w:top w:w="0" w:type="dxa"/>
-            <w:bottom w:w="0" w:type="dxa"/>
-          </w:tblCellMar>
-        </w:tblPrEx>
         <w:trPr>
           <w:cantSplit/>
         </w:trPr>
@@ -16617,12 +15767,6 @@
         </w:tc>
       </w:tr>
       <w:tr>
-        <w:tblPrEx>
-          <w:tblCellMar>
-            <w:top w:w="0" w:type="dxa"/>
-            <w:bottom w:w="0" w:type="dxa"/>
-          </w:tblCellMar>
-        </w:tblPrEx>
         <w:trPr>
           <w:cantSplit/>
         </w:trPr>
@@ -16720,12 +15864,6 @@
         </w:tc>
       </w:tr>
       <w:tr>
-        <w:tblPrEx>
-          <w:tblCellMar>
-            <w:top w:w="0" w:type="dxa"/>
-            <w:bottom w:w="0" w:type="dxa"/>
-          </w:tblCellMar>
-        </w:tblPrEx>
         <w:trPr>
           <w:cantSplit/>
         </w:trPr>
@@ -16857,12 +15995,6 @@
         <w:gridCol w:w="9600"/>
       </w:tblGrid>
       <w:tr>
-        <w:tblPrEx>
-          <w:tblCellMar>
-            <w:top w:w="0" w:type="dxa"/>
-            <w:bottom w:w="0" w:type="dxa"/>
-          </w:tblCellMar>
-        </w:tblPrEx>
         <w:trPr>
           <w:cantSplit/>
           <w:jc w:val="center"/>
@@ -17010,12 +16142,6 @@
         <w:gridCol w:w="6960"/>
       </w:tblGrid>
       <w:tr>
-        <w:tblPrEx>
-          <w:tblCellMar>
-            <w:top w:w="0" w:type="dxa"/>
-            <w:bottom w:w="0" w:type="dxa"/>
-          </w:tblCellMar>
-        </w:tblPrEx>
         <w:trPr>
           <w:tblHeader/>
         </w:trPr>
@@ -17073,12 +16199,6 @@
         </w:tc>
       </w:tr>
       <w:tr>
-        <w:tblPrEx>
-          <w:tblCellMar>
-            <w:top w:w="0" w:type="dxa"/>
-            <w:bottom w:w="0" w:type="dxa"/>
-          </w:tblCellMar>
-        </w:tblPrEx>
         <w:trPr>
           <w:cantSplit/>
         </w:trPr>
@@ -17130,12 +16250,6 @@
         </w:tc>
       </w:tr>
       <w:tr>
-        <w:tblPrEx>
-          <w:tblCellMar>
-            <w:top w:w="0" w:type="dxa"/>
-            <w:bottom w:w="0" w:type="dxa"/>
-          </w:tblCellMar>
-        </w:tblPrEx>
         <w:trPr>
           <w:cantSplit/>
         </w:trPr>
@@ -17393,12 +16507,6 @@
         <w:gridCol w:w="6240"/>
       </w:tblGrid>
       <w:tr>
-        <w:tblPrEx>
-          <w:tblCellMar>
-            <w:top w:w="0" w:type="dxa"/>
-            <w:bottom w:w="0" w:type="dxa"/>
-          </w:tblCellMar>
-        </w:tblPrEx>
         <w:trPr>
           <w:tblHeader/>
         </w:trPr>
@@ -17456,12 +16564,6 @@
         </w:tc>
       </w:tr>
       <w:tr>
-        <w:tblPrEx>
-          <w:tblCellMar>
-            <w:top w:w="0" w:type="dxa"/>
-            <w:bottom w:w="0" w:type="dxa"/>
-          </w:tblCellMar>
-        </w:tblPrEx>
         <w:trPr>
           <w:cantSplit/>
         </w:trPr>
@@ -17513,12 +16615,6 @@
         </w:tc>
       </w:tr>
       <w:tr>
-        <w:tblPrEx>
-          <w:tblCellMar>
-            <w:top w:w="0" w:type="dxa"/>
-            <w:bottom w:w="0" w:type="dxa"/>
-          </w:tblCellMar>
-        </w:tblPrEx>
         <w:trPr>
           <w:cantSplit/>
         </w:trPr>
@@ -17570,12 +16666,6 @@
         </w:tc>
       </w:tr>
       <w:tr>
-        <w:tblPrEx>
-          <w:tblCellMar>
-            <w:top w:w="0" w:type="dxa"/>
-            <w:bottom w:w="0" w:type="dxa"/>
-          </w:tblCellMar>
-        </w:tblPrEx>
         <w:trPr>
           <w:cantSplit/>
         </w:trPr>
@@ -17627,12 +16717,6 @@
         </w:tc>
       </w:tr>
       <w:tr>
-        <w:tblPrEx>
-          <w:tblCellMar>
-            <w:top w:w="0" w:type="dxa"/>
-            <w:bottom w:w="0" w:type="dxa"/>
-          </w:tblCellMar>
-        </w:tblPrEx>
         <w:trPr>
           <w:cantSplit/>
         </w:trPr>
@@ -17684,12 +16768,6 @@
         </w:tc>
       </w:tr>
       <w:tr>
-        <w:tblPrEx>
-          <w:tblCellMar>
-            <w:top w:w="0" w:type="dxa"/>
-            <w:bottom w:w="0" w:type="dxa"/>
-          </w:tblCellMar>
-        </w:tblPrEx>
         <w:trPr>
           <w:cantSplit/>
         </w:trPr>
@@ -17741,12 +16819,6 @@
         </w:tc>
       </w:tr>
       <w:tr>
-        <w:tblPrEx>
-          <w:tblCellMar>
-            <w:top w:w="0" w:type="dxa"/>
-            <w:bottom w:w="0" w:type="dxa"/>
-          </w:tblCellMar>
-        </w:tblPrEx>
         <w:trPr>
           <w:cantSplit/>
         </w:trPr>
@@ -17798,12 +16870,6 @@
         </w:tc>
       </w:tr>
       <w:tr>
-        <w:tblPrEx>
-          <w:tblCellMar>
-            <w:top w:w="0" w:type="dxa"/>
-            <w:bottom w:w="0" w:type="dxa"/>
-          </w:tblCellMar>
-        </w:tblPrEx>
         <w:trPr>
           <w:cantSplit/>
         </w:trPr>
@@ -18029,12 +17095,6 @@
         <w:gridCol w:w="6240"/>
       </w:tblGrid>
       <w:tr>
-        <w:tblPrEx>
-          <w:tblCellMar>
-            <w:top w:w="0" w:type="dxa"/>
-            <w:bottom w:w="0" w:type="dxa"/>
-          </w:tblCellMar>
-        </w:tblPrEx>
         <w:trPr>
           <w:tblHeader/>
         </w:trPr>
@@ -18092,12 +17152,6 @@
         </w:tc>
       </w:tr>
       <w:tr>
-        <w:tblPrEx>
-          <w:tblCellMar>
-            <w:top w:w="0" w:type="dxa"/>
-            <w:bottom w:w="0" w:type="dxa"/>
-          </w:tblCellMar>
-        </w:tblPrEx>
         <w:trPr>
           <w:cantSplit/>
         </w:trPr>
@@ -18149,12 +17203,6 @@
         </w:tc>
       </w:tr>
       <w:tr>
-        <w:tblPrEx>
-          <w:tblCellMar>
-            <w:top w:w="0" w:type="dxa"/>
-            <w:bottom w:w="0" w:type="dxa"/>
-          </w:tblCellMar>
-        </w:tblPrEx>
         <w:trPr>
           <w:cantSplit/>
         </w:trPr>
@@ -18206,12 +17254,6 @@
         </w:tc>
       </w:tr>
       <w:tr>
-        <w:tblPrEx>
-          <w:tblCellMar>
-            <w:top w:w="0" w:type="dxa"/>
-            <w:bottom w:w="0" w:type="dxa"/>
-          </w:tblCellMar>
-        </w:tblPrEx>
         <w:trPr>
           <w:cantSplit/>
         </w:trPr>
@@ -18263,12 +17305,6 @@
         </w:tc>
       </w:tr>
       <w:tr>
-        <w:tblPrEx>
-          <w:tblCellMar>
-            <w:top w:w="0" w:type="dxa"/>
-            <w:bottom w:w="0" w:type="dxa"/>
-          </w:tblCellMar>
-        </w:tblPrEx>
         <w:trPr>
           <w:cantSplit/>
         </w:trPr>
@@ -18571,12 +17607,6 @@
         <w:gridCol w:w="3460"/>
       </w:tblGrid>
       <w:tr>
-        <w:tblPrEx>
-          <w:tblCellMar>
-            <w:top w:w="0" w:type="dxa"/>
-            <w:bottom w:w="0" w:type="dxa"/>
-          </w:tblCellMar>
-        </w:tblPrEx>
         <w:trPr>
           <w:tblHeader/>
         </w:trPr>
@@ -18660,12 +17690,6 @@
         </w:tc>
       </w:tr>
       <w:tr>
-        <w:tblPrEx>
-          <w:tblCellMar>
-            <w:top w:w="0" w:type="dxa"/>
-            <w:bottom w:w="0" w:type="dxa"/>
-          </w:tblCellMar>
-        </w:tblPrEx>
         <w:trPr>
           <w:cantSplit/>
         </w:trPr>
@@ -18740,12 +17764,6 @@
         </w:tc>
       </w:tr>
       <w:tr>
-        <w:tblPrEx>
-          <w:tblCellMar>
-            <w:top w:w="0" w:type="dxa"/>
-            <w:bottom w:w="0" w:type="dxa"/>
-          </w:tblCellMar>
-        </w:tblPrEx>
         <w:trPr>
           <w:cantSplit/>
         </w:trPr>
@@ -18820,12 +17838,6 @@
         </w:tc>
       </w:tr>
       <w:tr>
-        <w:tblPrEx>
-          <w:tblCellMar>
-            <w:top w:w="0" w:type="dxa"/>
-            <w:bottom w:w="0" w:type="dxa"/>
-          </w:tblCellMar>
-        </w:tblPrEx>
         <w:trPr>
           <w:cantSplit/>
         </w:trPr>
@@ -18900,12 +17912,6 @@
         </w:tc>
       </w:tr>
       <w:tr>
-        <w:tblPrEx>
-          <w:tblCellMar>
-            <w:top w:w="0" w:type="dxa"/>
-            <w:bottom w:w="0" w:type="dxa"/>
-          </w:tblCellMar>
-        </w:tblPrEx>
         <w:trPr>
           <w:cantSplit/>
         </w:trPr>
@@ -18980,12 +17986,6 @@
         </w:tc>
       </w:tr>
       <w:tr>
-        <w:tblPrEx>
-          <w:tblCellMar>
-            <w:top w:w="0" w:type="dxa"/>
-            <w:bottom w:w="0" w:type="dxa"/>
-          </w:tblCellMar>
-        </w:tblPrEx>
         <w:trPr>
           <w:cantSplit/>
         </w:trPr>
@@ -19352,12 +18352,6 @@
         <w:gridCol w:w="3360"/>
       </w:tblGrid>
       <w:tr>
-        <w:tblPrEx>
-          <w:tblCellMar>
-            <w:top w:w="0" w:type="dxa"/>
-            <w:bottom w:w="0" w:type="dxa"/>
-          </w:tblCellMar>
-        </w:tblPrEx>
         <w:trPr>
           <w:tblHeader/>
         </w:trPr>
@@ -19441,12 +18435,6 @@
         </w:tc>
       </w:tr>
       <w:tr>
-        <w:tblPrEx>
-          <w:tblCellMar>
-            <w:top w:w="0" w:type="dxa"/>
-            <w:bottom w:w="0" w:type="dxa"/>
-          </w:tblCellMar>
-        </w:tblPrEx>
         <w:trPr>
           <w:cantSplit/>
         </w:trPr>
@@ -19521,12 +18509,6 @@
         </w:tc>
       </w:tr>
       <w:tr>
-        <w:tblPrEx>
-          <w:tblCellMar>
-            <w:top w:w="0" w:type="dxa"/>
-            <w:bottom w:w="0" w:type="dxa"/>
-          </w:tblCellMar>
-        </w:tblPrEx>
         <w:trPr>
           <w:cantSplit/>
         </w:trPr>
@@ -19601,12 +18583,6 @@
         </w:tc>
       </w:tr>
       <w:tr>
-        <w:tblPrEx>
-          <w:tblCellMar>
-            <w:top w:w="0" w:type="dxa"/>
-            <w:bottom w:w="0" w:type="dxa"/>
-          </w:tblCellMar>
-        </w:tblPrEx>
         <w:trPr>
           <w:cantSplit/>
         </w:trPr>
@@ -19681,12 +18657,6 @@
         </w:tc>
       </w:tr>
       <w:tr>
-        <w:tblPrEx>
-          <w:tblCellMar>
-            <w:top w:w="0" w:type="dxa"/>
-            <w:bottom w:w="0" w:type="dxa"/>
-          </w:tblCellMar>
-        </w:tblPrEx>
         <w:trPr>
           <w:cantSplit/>
         </w:trPr>
@@ -19829,12 +18799,6 @@
         <w:gridCol w:w="6240"/>
       </w:tblGrid>
       <w:tr>
-        <w:tblPrEx>
-          <w:tblCellMar>
-            <w:top w:w="0" w:type="dxa"/>
-            <w:bottom w:w="0" w:type="dxa"/>
-          </w:tblCellMar>
-        </w:tblPrEx>
         <w:trPr>
           <w:tblHeader/>
         </w:trPr>
@@ -19892,12 +18856,6 @@
         </w:tc>
       </w:tr>
       <w:tr>
-        <w:tblPrEx>
-          <w:tblCellMar>
-            <w:top w:w="0" w:type="dxa"/>
-            <w:bottom w:w="0" w:type="dxa"/>
-          </w:tblCellMar>
-        </w:tblPrEx>
         <w:trPr>
           <w:cantSplit/>
         </w:trPr>
@@ -19949,12 +18907,6 @@
         </w:tc>
       </w:tr>
       <w:tr>
-        <w:tblPrEx>
-          <w:tblCellMar>
-            <w:top w:w="0" w:type="dxa"/>
-            <w:bottom w:w="0" w:type="dxa"/>
-          </w:tblCellMar>
-        </w:tblPrEx>
         <w:trPr>
           <w:cantSplit/>
         </w:trPr>
@@ -20006,12 +18958,6 @@
         </w:tc>
       </w:tr>
       <w:tr>
-        <w:tblPrEx>
-          <w:tblCellMar>
-            <w:top w:w="0" w:type="dxa"/>
-            <w:bottom w:w="0" w:type="dxa"/>
-          </w:tblCellMar>
-        </w:tblPrEx>
         <w:trPr>
           <w:cantSplit/>
         </w:trPr>
@@ -20063,12 +19009,6 @@
         </w:tc>
       </w:tr>
       <w:tr>
-        <w:tblPrEx>
-          <w:tblCellMar>
-            <w:top w:w="0" w:type="dxa"/>
-            <w:bottom w:w="0" w:type="dxa"/>
-          </w:tblCellMar>
-        </w:tblPrEx>
         <w:trPr>
           <w:cantSplit/>
         </w:trPr>
@@ -20120,12 +19060,6 @@
         </w:tc>
       </w:tr>
       <w:tr>
-        <w:tblPrEx>
-          <w:tblCellMar>
-            <w:top w:w="0" w:type="dxa"/>
-            <w:bottom w:w="0" w:type="dxa"/>
-          </w:tblCellMar>
-        </w:tblPrEx>
         <w:trPr>
           <w:cantSplit/>
         </w:trPr>
@@ -20390,12 +19324,6 @@
         <w:gridCol w:w="6240"/>
       </w:tblGrid>
       <w:tr>
-        <w:tblPrEx>
-          <w:tblCellMar>
-            <w:top w:w="0" w:type="dxa"/>
-            <w:bottom w:w="0" w:type="dxa"/>
-          </w:tblCellMar>
-        </w:tblPrEx>
         <w:trPr>
           <w:tblHeader/>
         </w:trPr>
@@ -20453,12 +19381,6 @@
         </w:tc>
       </w:tr>
       <w:tr>
-        <w:tblPrEx>
-          <w:tblCellMar>
-            <w:top w:w="0" w:type="dxa"/>
-            <w:bottom w:w="0" w:type="dxa"/>
-          </w:tblCellMar>
-        </w:tblPrEx>
         <w:trPr>
           <w:cantSplit/>
         </w:trPr>
@@ -20510,12 +19432,6 @@
         </w:tc>
       </w:tr>
       <w:tr>
-        <w:tblPrEx>
-          <w:tblCellMar>
-            <w:top w:w="0" w:type="dxa"/>
-            <w:bottom w:w="0" w:type="dxa"/>
-          </w:tblCellMar>
-        </w:tblPrEx>
         <w:trPr>
           <w:cantSplit/>
         </w:trPr>
@@ -20567,12 +19483,6 @@
         </w:tc>
       </w:tr>
       <w:tr>
-        <w:tblPrEx>
-          <w:tblCellMar>
-            <w:top w:w="0" w:type="dxa"/>
-            <w:bottom w:w="0" w:type="dxa"/>
-          </w:tblCellMar>
-        </w:tblPrEx>
         <w:trPr>
           <w:cantSplit/>
         </w:trPr>
@@ -20624,12 +19534,6 @@
         </w:tc>
       </w:tr>
       <w:tr>
-        <w:tblPrEx>
-          <w:tblCellMar>
-            <w:top w:w="0" w:type="dxa"/>
-            <w:bottom w:w="0" w:type="dxa"/>
-          </w:tblCellMar>
-        </w:tblPrEx>
         <w:trPr>
           <w:cantSplit/>
         </w:trPr>
@@ -20681,12 +19585,6 @@
         </w:tc>
       </w:tr>
       <w:tr>
-        <w:tblPrEx>
-          <w:tblCellMar>
-            <w:top w:w="0" w:type="dxa"/>
-            <w:bottom w:w="0" w:type="dxa"/>
-          </w:tblCellMar>
-        </w:tblPrEx>
         <w:trPr>
           <w:cantSplit/>
         </w:trPr>
@@ -20738,12 +19636,6 @@
         </w:tc>
       </w:tr>
       <w:tr>
-        <w:tblPrEx>
-          <w:tblCellMar>
-            <w:top w:w="0" w:type="dxa"/>
-            <w:bottom w:w="0" w:type="dxa"/>
-          </w:tblCellMar>
-        </w:tblPrEx>
         <w:trPr>
           <w:cantSplit/>
         </w:trPr>
@@ -20795,12 +19687,6 @@
         </w:tc>
       </w:tr>
       <w:tr>
-        <w:tblPrEx>
-          <w:tblCellMar>
-            <w:top w:w="0" w:type="dxa"/>
-            <w:bottom w:w="0" w:type="dxa"/>
-          </w:tblCellMar>
-        </w:tblPrEx>
         <w:trPr>
           <w:cantSplit/>
         </w:trPr>
@@ -20852,12 +19738,6 @@
         </w:tc>
       </w:tr>
       <w:tr>
-        <w:tblPrEx>
-          <w:tblCellMar>
-            <w:top w:w="0" w:type="dxa"/>
-            <w:bottom w:w="0" w:type="dxa"/>
-          </w:tblCellMar>
-        </w:tblPrEx>
         <w:trPr>
           <w:cantSplit/>
         </w:trPr>
@@ -20909,12 +19789,6 @@
         </w:tc>
       </w:tr>
       <w:tr>
-        <w:tblPrEx>
-          <w:tblCellMar>
-            <w:top w:w="0" w:type="dxa"/>
-            <w:bottom w:w="0" w:type="dxa"/>
-          </w:tblCellMar>
-        </w:tblPrEx>
         <w:trPr>
           <w:cantSplit/>
         </w:trPr>
@@ -21068,12 +19942,6 @@
         <w:gridCol w:w="3120"/>
       </w:tblGrid>
       <w:tr>
-        <w:tblPrEx>
-          <w:tblCellMar>
-            <w:top w:w="0" w:type="dxa"/>
-            <w:bottom w:w="0" w:type="dxa"/>
-          </w:tblCellMar>
-        </w:tblPrEx>
         <w:trPr>
           <w:tblHeader/>
         </w:trPr>
@@ -21158,12 +20026,6 @@
         </w:tc>
       </w:tr>
       <w:tr>
-        <w:tblPrEx>
-          <w:tblCellMar>
-            <w:top w:w="0" w:type="dxa"/>
-            <w:bottom w:w="0" w:type="dxa"/>
-          </w:tblCellMar>
-        </w:tblPrEx>
         <w:trPr>
           <w:cantSplit/>
         </w:trPr>
@@ -21238,12 +20100,6 @@
         </w:tc>
       </w:tr>
       <w:tr>
-        <w:tblPrEx>
-          <w:tblCellMar>
-            <w:top w:w="0" w:type="dxa"/>
-            <w:bottom w:w="0" w:type="dxa"/>
-          </w:tblCellMar>
-        </w:tblPrEx>
         <w:trPr>
           <w:cantSplit/>
         </w:trPr>
@@ -21318,12 +20174,6 @@
         </w:tc>
       </w:tr>
       <w:tr>
-        <w:tblPrEx>
-          <w:tblCellMar>
-            <w:top w:w="0" w:type="dxa"/>
-            <w:bottom w:w="0" w:type="dxa"/>
-          </w:tblCellMar>
-        </w:tblPrEx>
         <w:trPr>
           <w:cantSplit/>
         </w:trPr>
@@ -21398,12 +20248,6 @@
         </w:tc>
       </w:tr>
       <w:tr>
-        <w:tblPrEx>
-          <w:tblCellMar>
-            <w:top w:w="0" w:type="dxa"/>
-            <w:bottom w:w="0" w:type="dxa"/>
-          </w:tblCellMar>
-        </w:tblPrEx>
         <w:trPr>
           <w:cantSplit/>
         </w:trPr>
@@ -21478,12 +20322,6 @@
         </w:tc>
       </w:tr>
       <w:tr>
-        <w:tblPrEx>
-          <w:tblCellMar>
-            <w:top w:w="0" w:type="dxa"/>
-            <w:bottom w:w="0" w:type="dxa"/>
-          </w:tblCellMar>
-        </w:tblPrEx>
         <w:trPr>
           <w:cantSplit/>
         </w:trPr>
@@ -21600,12 +20438,6 @@
         <w:gridCol w:w="5960"/>
       </w:tblGrid>
       <w:tr>
-        <w:tblPrEx>
-          <w:tblCellMar>
-            <w:top w:w="0" w:type="dxa"/>
-            <w:bottom w:w="0" w:type="dxa"/>
-          </w:tblCellMar>
-        </w:tblPrEx>
         <w:trPr>
           <w:tblHeader/>
         </w:trPr>
@@ -21663,12 +20495,6 @@
         </w:tc>
       </w:tr>
       <w:tr>
-        <w:tblPrEx>
-          <w:tblCellMar>
-            <w:top w:w="0" w:type="dxa"/>
-            <w:bottom w:w="0" w:type="dxa"/>
-          </w:tblCellMar>
-        </w:tblPrEx>
         <w:trPr>
           <w:cantSplit/>
         </w:trPr>
@@ -21720,12 +20546,6 @@
         </w:tc>
       </w:tr>
       <w:tr>
-        <w:tblPrEx>
-          <w:tblCellMar>
-            <w:top w:w="0" w:type="dxa"/>
-            <w:bottom w:w="0" w:type="dxa"/>
-          </w:tblCellMar>
-        </w:tblPrEx>
         <w:trPr>
           <w:cantSplit/>
         </w:trPr>
@@ -21777,12 +20597,6 @@
         </w:tc>
       </w:tr>
       <w:tr>
-        <w:tblPrEx>
-          <w:tblCellMar>
-            <w:top w:w="0" w:type="dxa"/>
-            <w:bottom w:w="0" w:type="dxa"/>
-          </w:tblCellMar>
-        </w:tblPrEx>
         <w:trPr>
           <w:cantSplit/>
         </w:trPr>
@@ -21834,12 +20648,6 @@
         </w:tc>
       </w:tr>
       <w:tr>
-        <w:tblPrEx>
-          <w:tblCellMar>
-            <w:top w:w="0" w:type="dxa"/>
-            <w:bottom w:w="0" w:type="dxa"/>
-          </w:tblCellMar>
-        </w:tblPrEx>
         <w:trPr>
           <w:cantSplit/>
         </w:trPr>
@@ -21891,12 +20699,6 @@
         </w:tc>
       </w:tr>
       <w:tr>
-        <w:tblPrEx>
-          <w:tblCellMar>
-            <w:top w:w="0" w:type="dxa"/>
-            <w:bottom w:w="0" w:type="dxa"/>
-          </w:tblCellMar>
-        </w:tblPrEx>
         <w:trPr>
           <w:cantSplit/>
         </w:trPr>
@@ -22074,12 +20876,6 @@
         <w:gridCol w:w="2560"/>
       </w:tblGrid>
       <w:tr>
-        <w:tblPrEx>
-          <w:tblCellMar>
-            <w:top w:w="0" w:type="dxa"/>
-            <w:bottom w:w="0" w:type="dxa"/>
-          </w:tblCellMar>
-        </w:tblPrEx>
         <w:trPr>
           <w:tblHeader/>
         </w:trPr>
@@ -22163,12 +20959,6 @@
         </w:tc>
       </w:tr>
       <w:tr>
-        <w:tblPrEx>
-          <w:tblCellMar>
-            <w:top w:w="0" w:type="dxa"/>
-            <w:bottom w:w="0" w:type="dxa"/>
-          </w:tblCellMar>
-        </w:tblPrEx>
         <w:trPr>
           <w:cantSplit/>
         </w:trPr>
@@ -22243,12 +21033,6 @@
         </w:tc>
       </w:tr>
       <w:tr>
-        <w:tblPrEx>
-          <w:tblCellMar>
-            <w:top w:w="0" w:type="dxa"/>
-            <w:bottom w:w="0" w:type="dxa"/>
-          </w:tblCellMar>
-        </w:tblPrEx>
         <w:trPr>
           <w:cantSplit/>
         </w:trPr>
@@ -22323,12 +21107,6 @@
         </w:tc>
       </w:tr>
       <w:tr>
-        <w:tblPrEx>
-          <w:tblCellMar>
-            <w:top w:w="0" w:type="dxa"/>
-            <w:bottom w:w="0" w:type="dxa"/>
-          </w:tblCellMar>
-        </w:tblPrEx>
         <w:trPr>
           <w:cantSplit/>
         </w:trPr>
@@ -22403,12 +21181,6 @@
         </w:tc>
       </w:tr>
       <w:tr>
-        <w:tblPrEx>
-          <w:tblCellMar>
-            <w:top w:w="0" w:type="dxa"/>
-            <w:bottom w:w="0" w:type="dxa"/>
-          </w:tblCellMar>
-        </w:tblPrEx>
         <w:trPr>
           <w:cantSplit/>
         </w:trPr>
@@ -22483,12 +21255,6 @@
         </w:tc>
       </w:tr>
       <w:tr>
-        <w:tblPrEx>
-          <w:tblCellMar>
-            <w:top w:w="0" w:type="dxa"/>
-            <w:bottom w:w="0" w:type="dxa"/>
-          </w:tblCellMar>
-        </w:tblPrEx>
         <w:trPr>
           <w:cantSplit/>
         </w:trPr>
@@ -22563,12 +21329,6 @@
         </w:tc>
       </w:tr>
       <w:tr>
-        <w:tblPrEx>
-          <w:tblCellMar>
-            <w:top w:w="0" w:type="dxa"/>
-            <w:bottom w:w="0" w:type="dxa"/>
-          </w:tblCellMar>
-        </w:tblPrEx>
         <w:trPr>
           <w:cantSplit/>
         </w:trPr>
@@ -22834,12 +21594,6 @@
         <w:gridCol w:w="6560"/>
       </w:tblGrid>
       <w:tr>
-        <w:tblPrEx>
-          <w:tblCellMar>
-            <w:top w:w="0" w:type="dxa"/>
-            <w:bottom w:w="0" w:type="dxa"/>
-          </w:tblCellMar>
-        </w:tblPrEx>
         <w:trPr>
           <w:tblHeader/>
         </w:trPr>
@@ -22897,12 +21651,6 @@
         </w:tc>
       </w:tr>
       <w:tr>
-        <w:tblPrEx>
-          <w:tblCellMar>
-            <w:top w:w="0" w:type="dxa"/>
-            <w:bottom w:w="0" w:type="dxa"/>
-          </w:tblCellMar>
-        </w:tblPrEx>
         <w:trPr>
           <w:cantSplit/>
         </w:trPr>
@@ -22954,12 +21702,6 @@
         </w:tc>
       </w:tr>
       <w:tr>
-        <w:tblPrEx>
-          <w:tblCellMar>
-            <w:top w:w="0" w:type="dxa"/>
-            <w:bottom w:w="0" w:type="dxa"/>
-          </w:tblCellMar>
-        </w:tblPrEx>
         <w:trPr>
           <w:cantSplit/>
         </w:trPr>
@@ -23011,12 +21753,6 @@
         </w:tc>
       </w:tr>
       <w:tr>
-        <w:tblPrEx>
-          <w:tblCellMar>
-            <w:top w:w="0" w:type="dxa"/>
-            <w:bottom w:w="0" w:type="dxa"/>
-          </w:tblCellMar>
-        </w:tblPrEx>
         <w:trPr>
           <w:cantSplit/>
         </w:trPr>
@@ -23068,12 +21804,6 @@
         </w:tc>
       </w:tr>
       <w:tr>
-        <w:tblPrEx>
-          <w:tblCellMar>
-            <w:top w:w="0" w:type="dxa"/>
-            <w:bottom w:w="0" w:type="dxa"/>
-          </w:tblCellMar>
-        </w:tblPrEx>
         <w:trPr>
           <w:cantSplit/>
         </w:trPr>
@@ -23125,12 +21855,6 @@
         </w:tc>
       </w:tr>
       <w:tr>
-        <w:tblPrEx>
-          <w:tblCellMar>
-            <w:top w:w="0" w:type="dxa"/>
-            <w:bottom w:w="0" w:type="dxa"/>
-          </w:tblCellMar>
-        </w:tblPrEx>
         <w:trPr>
           <w:cantSplit/>
         </w:trPr>
@@ -23182,12 +21906,6 @@
         </w:tc>
       </w:tr>
       <w:tr>
-        <w:tblPrEx>
-          <w:tblCellMar>
-            <w:top w:w="0" w:type="dxa"/>
-            <w:bottom w:w="0" w:type="dxa"/>
-          </w:tblCellMar>
-        </w:tblPrEx>
         <w:trPr>
           <w:cantSplit/>
         </w:trPr>
@@ -23239,12 +21957,6 @@
         </w:tc>
       </w:tr>
       <w:tr>
-        <w:tblPrEx>
-          <w:tblCellMar>
-            <w:top w:w="0" w:type="dxa"/>
-            <w:bottom w:w="0" w:type="dxa"/>
-          </w:tblCellMar>
-        </w:tblPrEx>
         <w:trPr>
           <w:cantSplit/>
         </w:trPr>
@@ -23296,12 +22008,6 @@
         </w:tc>
       </w:tr>
       <w:tr>
-        <w:tblPrEx>
-          <w:tblCellMar>
-            <w:top w:w="0" w:type="dxa"/>
-            <w:bottom w:w="0" w:type="dxa"/>
-          </w:tblCellMar>
-        </w:tblPrEx>
         <w:trPr>
           <w:cantSplit/>
         </w:trPr>
@@ -23353,12 +22059,6 @@
         </w:tc>
       </w:tr>
       <w:tr>
-        <w:tblPrEx>
-          <w:tblCellMar>
-            <w:top w:w="0" w:type="dxa"/>
-            <w:bottom w:w="0" w:type="dxa"/>
-          </w:tblCellMar>
-        </w:tblPrEx>
         <w:trPr>
           <w:cantSplit/>
         </w:trPr>
@@ -23410,12 +22110,6 @@
         </w:tc>
       </w:tr>
       <w:tr>
-        <w:tblPrEx>
-          <w:tblCellMar>
-            <w:top w:w="0" w:type="dxa"/>
-            <w:bottom w:w="0" w:type="dxa"/>
-          </w:tblCellMar>
-        </w:tblPrEx>
         <w:trPr>
           <w:cantSplit/>
         </w:trPr>
@@ -23644,12 +22338,6 @@
         <w:gridCol w:w="6960"/>
       </w:tblGrid>
       <w:tr>
-        <w:tblPrEx>
-          <w:tblCellMar>
-            <w:top w:w="0" w:type="dxa"/>
-            <w:bottom w:w="0" w:type="dxa"/>
-          </w:tblCellMar>
-        </w:tblPrEx>
         <w:trPr>
           <w:tblHeader/>
         </w:trPr>
@@ -23707,12 +22395,6 @@
         </w:tc>
       </w:tr>
       <w:tr>
-        <w:tblPrEx>
-          <w:tblCellMar>
-            <w:top w:w="0" w:type="dxa"/>
-            <w:bottom w:w="0" w:type="dxa"/>
-          </w:tblCellMar>
-        </w:tblPrEx>
         <w:trPr>
           <w:cantSplit/>
         </w:trPr>
@@ -23764,12 +22446,6 @@
         </w:tc>
       </w:tr>
       <w:tr>
-        <w:tblPrEx>
-          <w:tblCellMar>
-            <w:top w:w="0" w:type="dxa"/>
-            <w:bottom w:w="0" w:type="dxa"/>
-          </w:tblCellMar>
-        </w:tblPrEx>
         <w:trPr>
           <w:cantSplit/>
         </w:trPr>
@@ -23821,12 +22497,6 @@
         </w:tc>
       </w:tr>
       <w:tr>
-        <w:tblPrEx>
-          <w:tblCellMar>
-            <w:top w:w="0" w:type="dxa"/>
-            <w:bottom w:w="0" w:type="dxa"/>
-          </w:tblCellMar>
-        </w:tblPrEx>
         <w:trPr>
           <w:cantSplit/>
         </w:trPr>
@@ -23878,12 +22548,6 @@
         </w:tc>
       </w:tr>
       <w:tr>
-        <w:tblPrEx>
-          <w:tblCellMar>
-            <w:top w:w="0" w:type="dxa"/>
-            <w:bottom w:w="0" w:type="dxa"/>
-          </w:tblCellMar>
-        </w:tblPrEx>
         <w:trPr>
           <w:cantSplit/>
         </w:trPr>
@@ -23972,12 +22636,6 @@
         <w:gridCol w:w="6960"/>
       </w:tblGrid>
       <w:tr>
-        <w:tblPrEx>
-          <w:tblCellMar>
-            <w:top w:w="0" w:type="dxa"/>
-            <w:bottom w:w="0" w:type="dxa"/>
-          </w:tblCellMar>
-        </w:tblPrEx>
         <w:trPr>
           <w:tblHeader/>
         </w:trPr>
@@ -24035,12 +22693,6 @@
         </w:tc>
       </w:tr>
       <w:tr>
-        <w:tblPrEx>
-          <w:tblCellMar>
-            <w:top w:w="0" w:type="dxa"/>
-            <w:bottom w:w="0" w:type="dxa"/>
-          </w:tblCellMar>
-        </w:tblPrEx>
         <w:trPr>
           <w:cantSplit/>
         </w:trPr>
@@ -24092,12 +22744,6 @@
         </w:tc>
       </w:tr>
       <w:tr>
-        <w:tblPrEx>
-          <w:tblCellMar>
-            <w:top w:w="0" w:type="dxa"/>
-            <w:bottom w:w="0" w:type="dxa"/>
-          </w:tblCellMar>
-        </w:tblPrEx>
         <w:trPr>
           <w:cantSplit/>
         </w:trPr>
@@ -24149,12 +22795,6 @@
         </w:tc>
       </w:tr>
       <w:tr>
-        <w:tblPrEx>
-          <w:tblCellMar>
-            <w:top w:w="0" w:type="dxa"/>
-            <w:bottom w:w="0" w:type="dxa"/>
-          </w:tblCellMar>
-        </w:tblPrEx>
         <w:trPr>
           <w:cantSplit/>
         </w:trPr>
@@ -24206,12 +22846,6 @@
         </w:tc>
       </w:tr>
       <w:tr>
-        <w:tblPrEx>
-          <w:tblCellMar>
-            <w:top w:w="0" w:type="dxa"/>
-            <w:bottom w:w="0" w:type="dxa"/>
-          </w:tblCellMar>
-        </w:tblPrEx>
         <w:trPr>
           <w:cantSplit/>
         </w:trPr>
@@ -24300,12 +22934,6 @@
         <w:gridCol w:w="6960"/>
       </w:tblGrid>
       <w:tr>
-        <w:tblPrEx>
-          <w:tblCellMar>
-            <w:top w:w="0" w:type="dxa"/>
-            <w:bottom w:w="0" w:type="dxa"/>
-          </w:tblCellMar>
-        </w:tblPrEx>
         <w:trPr>
           <w:tblHeader/>
         </w:trPr>
@@ -24363,12 +22991,6 @@
         </w:tc>
       </w:tr>
       <w:tr>
-        <w:tblPrEx>
-          <w:tblCellMar>
-            <w:top w:w="0" w:type="dxa"/>
-            <w:bottom w:w="0" w:type="dxa"/>
-          </w:tblCellMar>
-        </w:tblPrEx>
         <w:trPr>
           <w:cantSplit/>
         </w:trPr>
@@ -24420,12 +23042,6 @@
         </w:tc>
       </w:tr>
       <w:tr>
-        <w:tblPrEx>
-          <w:tblCellMar>
-            <w:top w:w="0" w:type="dxa"/>
-            <w:bottom w:w="0" w:type="dxa"/>
-          </w:tblCellMar>
-        </w:tblPrEx>
         <w:trPr>
           <w:cantSplit/>
         </w:trPr>
@@ -24477,12 +23093,6 @@
         </w:tc>
       </w:tr>
       <w:tr>
-        <w:tblPrEx>
-          <w:tblCellMar>
-            <w:top w:w="0" w:type="dxa"/>
-            <w:bottom w:w="0" w:type="dxa"/>
-          </w:tblCellMar>
-        </w:tblPrEx>
         <w:trPr>
           <w:cantSplit/>
         </w:trPr>
@@ -24571,12 +23181,6 @@
         <w:gridCol w:w="6960"/>
       </w:tblGrid>
       <w:tr>
-        <w:tblPrEx>
-          <w:tblCellMar>
-            <w:top w:w="0" w:type="dxa"/>
-            <w:bottom w:w="0" w:type="dxa"/>
-          </w:tblCellMar>
-        </w:tblPrEx>
         <w:trPr>
           <w:tblHeader/>
         </w:trPr>
@@ -24634,12 +23238,6 @@
         </w:tc>
       </w:tr>
       <w:tr>
-        <w:tblPrEx>
-          <w:tblCellMar>
-            <w:top w:w="0" w:type="dxa"/>
-            <w:bottom w:w="0" w:type="dxa"/>
-          </w:tblCellMar>
-        </w:tblPrEx>
         <w:trPr>
           <w:cantSplit/>
         </w:trPr>
@@ -24691,12 +23289,6 @@
         </w:tc>
       </w:tr>
       <w:tr>
-        <w:tblPrEx>
-          <w:tblCellMar>
-            <w:top w:w="0" w:type="dxa"/>
-            <w:bottom w:w="0" w:type="dxa"/>
-          </w:tblCellMar>
-        </w:tblPrEx>
         <w:trPr>
           <w:cantSplit/>
         </w:trPr>
@@ -24748,12 +23340,6 @@
         </w:tc>
       </w:tr>
       <w:tr>
-        <w:tblPrEx>
-          <w:tblCellMar>
-            <w:top w:w="0" w:type="dxa"/>
-            <w:bottom w:w="0" w:type="dxa"/>
-          </w:tblCellMar>
-        </w:tblPrEx>
         <w:trPr>
           <w:cantSplit/>
         </w:trPr>
@@ -24805,12 +23391,6 @@
         </w:tc>
       </w:tr>
       <w:tr>
-        <w:tblPrEx>
-          <w:tblCellMar>
-            <w:top w:w="0" w:type="dxa"/>
-            <w:bottom w:w="0" w:type="dxa"/>
-          </w:tblCellMar>
-        </w:tblPrEx>
         <w:trPr>
           <w:cantSplit/>
         </w:trPr>
@@ -24907,12 +23487,6 @@
         <w:gridCol w:w="9360"/>
       </w:tblGrid>
       <w:tr>
-        <w:tblPrEx>
-          <w:tblCellMar>
-            <w:top w:w="0" w:type="dxa"/>
-            <w:bottom w:w="0" w:type="dxa"/>
-          </w:tblCellMar>
-        </w:tblPrEx>
         <w:tc>
           <w:tcPr>
             <w:tcW w:w="9360" w:type="dxa"/>

</xml_diff>